<commit_message>
feat: add phase 6 calibration test suite and database security rules
</commit_message>
<xml_diff>
--- a/AQUA_INTELLIGENCE_Project_Report.docx
+++ b/AQUA_INTELLIGENCE_Project_Report.docx
@@ -3958,7 +3958,7 @@
     <w:p>
       <w:r>
         <w:pict w14:anchorId="4EBFE2B9">
-          <v:rect id="_x0000_i1031" style="width:180.3pt;height:.75pt" o:hrpct="0" o:hralign="center" o:hrstd="t" o:hr="t" fillcolor="#a0a0a0" stroked="f"/>
+          <v:rect id="_x0000_i1025" style="width:180.3pt;height:.75pt" o:hrpct="0" o:hralign="center" o:hrstd="t" o:hr="t" fillcolor="#a0a0a0" stroked="f"/>
         </w:pict>
       </w:r>
     </w:p>
@@ -5678,6 +5678,9 @@
         </w:rPr>
       </w:pPr>
       <w:r>
+        <w:rPr>
+          <w:noProof/>
+        </w:rPr>
         <mc:AlternateContent>
           <mc:Choice Requires="wps">
             <w:drawing>
@@ -5778,7 +5781,23 @@
         </w:numPr>
       </w:pPr>
       <w:r>
-        <w:t>Automatically loads fish_model.pkl, label_encoder.pkl, fish_species_stats.pkl, spice_model.pkl, and </w:t>
+        <w:t>Automatically loads fish_model.pkl, label_encoder.pkl, </w:t>
+      </w:r>
+      <w:proofErr w:type="spellStart"/>
+      <w:r>
+        <w:t>fish_species_stats.pkl</w:t>
+      </w:r>
+      <w:proofErr w:type="spellEnd"/>
+      <w:r>
+        <w:t>, </w:t>
+      </w:r>
+      <w:proofErr w:type="spellStart"/>
+      <w:r>
+        <w:t>spice_model.pkl</w:t>
+      </w:r>
+      <w:proofErr w:type="spellEnd"/>
+      <w:r>
+        <w:t>, and </w:t>
       </w:r>
       <w:proofErr w:type="spellStart"/>
       <w:r>
@@ -6031,6 +6050,9 @@
     </w:p>
     <w:p>
       <w:r>
+        <w:rPr>
+          <w:noProof/>
+        </w:rPr>
         <mc:AlternateContent>
           <mc:Choice Requires="wps">
             <w:drawing>
@@ -6114,7 +6136,7 @@
     <w:p>
       <w:r>
         <w:pict w14:anchorId="2DDE818D">
-          <v:rect id="_x0000_i1051" style="width:344.55pt;height:.75pt" o:hrpct="0" o:hralign="center" o:hrstd="t" o:hr="t" fillcolor="#a0a0a0" stroked="f"/>
+          <v:rect id="_x0000_i1026" style="width:344.55pt;height:.75pt" o:hrpct="0" o:hralign="center" o:hrstd="t" o:hr="t" fillcolor="#a0a0a0" stroked="f"/>
         </w:pict>
       </w:r>
     </w:p>
@@ -6539,7 +6561,7 @@
     <w:p>
       <w:r>
         <w:pict w14:anchorId="08F16913">
-          <v:rect id="_x0000_i1091" style="width:344.55pt;height:.75pt" o:hrpct="0" o:hralign="center" o:hrstd="t" o:hr="t" fillcolor="#a0a0a0" stroked="f"/>
+          <v:rect id="_x0000_i1027" style="width:344.55pt;height:.75pt" o:hrpct="0" o:hralign="center" o:hrstd="t" o:hr="t" fillcolor="#a0a0a0" stroked="f"/>
         </w:pict>
       </w:r>
     </w:p>
@@ -6630,7 +6652,7 @@
     <w:p>
       <w:r>
         <w:pict w14:anchorId="3058C0E4">
-          <v:rect id="_x0000_i1092" style="width:344.55pt;height:.75pt" o:hrpct="0" o:hralign="center" o:hrstd="t" o:hr="t" fillcolor="#a0a0a0" stroked="f"/>
+          <v:rect id="_x0000_i1028" style="width:344.55pt;height:.75pt" o:hrpct="0" o:hralign="center" o:hrstd="t" o:hr="t" fillcolor="#a0a0a0" stroked="f"/>
         </w:pict>
       </w:r>
     </w:p>
@@ -6831,7 +6853,7 @@
     <w:p>
       <w:r>
         <w:pict w14:anchorId="57ECAD23">
-          <v:rect id="_x0000_i1093" style="width:344.55pt;height:.75pt" o:hrpct="0" o:hralign="center" o:hrstd="t" o:hr="t" fillcolor="#a0a0a0" stroked="f"/>
+          <v:rect id="_x0000_i1029" style="width:344.55pt;height:.75pt" o:hrpct="0" o:hralign="center" o:hrstd="t" o:hr="t" fillcolor="#a0a0a0" stroked="f"/>
         </w:pict>
       </w:r>
     </w:p>
@@ -7268,7 +7290,7 @@
     <w:p>
       <w:r>
         <w:pict w14:anchorId="2DBB0E67">
-          <v:rect id="_x0000_i1094" style="width:344.55pt;height:.75pt" o:hrpct="0" o:hralign="center" o:hrstd="t" o:hr="t" fillcolor="#a0a0a0" stroked="f"/>
+          <v:rect id="_x0000_i1030" style="width:344.55pt;height:.75pt" o:hrpct="0" o:hralign="center" o:hrstd="t" o:hr="t" fillcolor="#a0a0a0" stroked="f"/>
         </w:pict>
       </w:r>
     </w:p>
@@ -7404,7 +7426,7 @@
     <w:p>
       <w:r>
         <w:pict w14:anchorId="7C245477">
-          <v:rect id="_x0000_i1095" style="width:344.55pt;height:.75pt" o:hrpct="0" o:hralign="center" o:hrstd="t" o:hr="t" fillcolor="#a0a0a0" stroked="f"/>
+          <v:rect id="_x0000_i1031" style="width:344.55pt;height:.75pt" o:hrpct="0" o:hralign="center" o:hrstd="t" o:hr="t" fillcolor="#a0a0a0" stroked="f"/>
         </w:pict>
       </w:r>
     </w:p>
@@ -7959,7 +7981,7 @@
     <w:p>
       <w:r>
         <w:pict w14:anchorId="18C94B46">
-          <v:rect id="_x0000_i1096" style="width:344.55pt;height:.75pt" o:hrpct="0" o:hralign="center" o:hrstd="t" o:hr="t" fillcolor="#a0a0a0" stroked="f"/>
+          <v:rect id="_x0000_i1032" style="width:344.55pt;height:.75pt" o:hrpct="0" o:hralign="center" o:hrstd="t" o:hr="t" fillcolor="#a0a0a0" stroked="f"/>
         </w:pict>
       </w:r>
     </w:p>
@@ -7994,6 +8016,1386 @@
     <w:p>
       <w:r>
         <w:t>The output array is sorted in descending order so the dashboard UI displays the most viable species at the top, and recommends species to avoid at the bottom!</w:t>
+      </w:r>
+    </w:p>
+    <w:p/>
+    <w:p>
+      <w:r>
+        <w:lastRenderedPageBreak/>
+        <w:t>Phase 5: Firebase Realtime Database Setup &amp; Security — Complete!</w:t>
+      </w:r>
+    </w:p>
+    <w:p>
+      <w:r>
+        <w:t>All milestones for </w:t>
+      </w:r>
+      <w:r>
+        <w:rPr>
+          <w:b/>
+          <w:bCs/>
+        </w:rPr>
+        <w:t>Phase 5</w:t>
+      </w:r>
+      <w:r>
+        <w:t> have been implemented, integrated, and verified across security rules, edge firmware, backend services, and dashboard charts.</w:t>
+      </w:r>
+    </w:p>
+    <w:p>
+      <w:r>
+        <w:pict w14:anchorId="2EB6D91A">
+          <v:rect id="_x0000_i1120" style="width:271.8pt;height:.75pt" o:hrpct="0" o:hralign="center" o:hrstd="t" o:hr="t" fillcolor="#a0a0a0" stroked="f"/>
+        </w:pict>
+      </w:r>
+    </w:p>
+    <w:p>
+      <w:r>
+        <w:t>What Was Built &amp; Configured</w:t>
+      </w:r>
+    </w:p>
+    <w:p>
+      <w:pPr>
+        <w:rPr>
+          <w:b/>
+          <w:bCs/>
+        </w:rPr>
+      </w:pPr>
+      <w:r>
+        <w:t>1. Realtime Database Security &amp; Validation Rules (</w:t>
+      </w:r>
+    </w:p>
+    <w:p>
+      <w:pPr>
+        <w:rPr>
+          <w:b/>
+          <w:bCs/>
+        </w:rPr>
+      </w:pPr>
+      <w:r>
+        <mc:AlternateContent>
+          <mc:Choice Requires="wps">
+            <w:drawing>
+              <wp:inline distT="0" distB="0" distL="0" distR="0" wp14:anchorId="37B39629" wp14:editId="56B29587">
+                <wp:extent cx="304800" cy="304800"/>
+                <wp:effectExtent l="0" t="0" r="0" b="0"/>
+                <wp:docPr id="1372870869" name="Rectangle 20"/>
+                <wp:cNvGraphicFramePr>
+                  <a:graphicFrameLocks xmlns:a="http://schemas.openxmlformats.org/drawingml/2006/main" noChangeAspect="1"/>
+                </wp:cNvGraphicFramePr>
+                <a:graphic xmlns:a="http://schemas.openxmlformats.org/drawingml/2006/main">
+                  <a:graphicData uri="http://schemas.microsoft.com/office/word/2010/wordprocessingShape">
+                    <wps:wsp>
+                      <wps:cNvSpPr>
+                        <a:spLocks noChangeAspect="1" noChangeArrowheads="1"/>
+                      </wps:cNvSpPr>
+                      <wps:spPr bwMode="auto">
+                        <a:xfrm>
+                          <a:off x="0" y="0"/>
+                          <a:ext cx="304800" cy="304800"/>
+                        </a:xfrm>
+                        <a:prstGeom prst="rect">
+                          <a:avLst/>
+                        </a:prstGeom>
+                        <a:noFill/>
+                        <a:ln>
+                          <a:noFill/>
+                        </a:ln>
+                        <a:extLst>
+                          <a:ext uri="{909E8E84-426E-40DD-AFC4-6F175D3DCCD1}">
+                            <a14:hiddenFill xmlns:a14="http://schemas.microsoft.com/office/drawing/2010/main">
+                              <a:solidFill>
+                                <a:srgbClr val="FFFFFF"/>
+                              </a:solidFill>
+                            </a14:hiddenFill>
+                          </a:ext>
+                          <a:ext uri="{91240B29-F687-4F45-9708-019B960494DF}">
+                            <a14:hiddenLine xmlns:a14="http://schemas.microsoft.com/office/drawing/2010/main" w="9525">
+                              <a:solidFill>
+                                <a:srgbClr val="000000"/>
+                              </a:solidFill>
+                              <a:miter lim="800000"/>
+                              <a:headEnd/>
+                              <a:tailEnd/>
+                            </a14:hiddenLine>
+                          </a:ext>
+                        </a:extLst>
+                      </wps:spPr>
+                      <wps:bodyPr rot="0" vert="horz" wrap="square" lIns="91440" tIns="45720" rIns="91440" bIns="45720" anchor="t" anchorCtr="0" upright="1">
+                        <a:noAutofit/>
+                      </wps:bodyPr>
+                    </wps:wsp>
+                  </a:graphicData>
+                </a:graphic>
+              </wp:inline>
+            </w:drawing>
+          </mc:Choice>
+          <mc:Fallback>
+            <w:pict>
+              <v:rect w14:anchorId="3D55573B" id="Rectangle 20" o:spid="_x0000_s1026" style="width:24pt;height:24pt;visibility:visible;mso-wrap-style:square;mso-left-percent:-10001;mso-top-percent:-10001;mso-position-horizontal:absolute;mso-position-horizontal-relative:char;mso-position-vertical:absolute;mso-position-vertical-relative:line;mso-left-percent:-10001;mso-top-percent:-10001;v-text-anchor:top" o:gfxdata="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" filled="f" stroked="f">
+                <o:lock v:ext="edit" aspectratio="t"/>
+                <w10:anchorlock/>
+              </v:rect>
+            </w:pict>
+          </mc:Fallback>
+        </mc:AlternateContent>
+      </w:r>
+    </w:p>
+    <w:p>
+      <w:pPr>
+        <w:rPr>
+          <w:b/>
+          <w:bCs/>
+        </w:rPr>
+      </w:pPr>
+      <w:proofErr w:type="spellStart"/>
+      <w:r>
+        <w:t>database.rules.json</w:t>
+      </w:r>
+      <w:proofErr w:type="spellEnd"/>
+      <w:r>
+        <w:t> &amp; </w:t>
+      </w:r>
+    </w:p>
+    <w:p>
+      <w:pPr>
+        <w:rPr>
+          <w:b/>
+          <w:bCs/>
+        </w:rPr>
+      </w:pPr>
+      <w:r>
+        <mc:AlternateContent>
+          <mc:Choice Requires="wps">
+            <w:drawing>
+              <wp:inline distT="0" distB="0" distL="0" distR="0" wp14:anchorId="7F9462F4" wp14:editId="0FCD6482">
+                <wp:extent cx="304800" cy="304800"/>
+                <wp:effectExtent l="0" t="0" r="0" b="0"/>
+                <wp:docPr id="2051325316" name="Rectangle 19"/>
+                <wp:cNvGraphicFramePr>
+                  <a:graphicFrameLocks xmlns:a="http://schemas.openxmlformats.org/drawingml/2006/main" noChangeAspect="1"/>
+                </wp:cNvGraphicFramePr>
+                <a:graphic xmlns:a="http://schemas.openxmlformats.org/drawingml/2006/main">
+                  <a:graphicData uri="http://schemas.microsoft.com/office/word/2010/wordprocessingShape">
+                    <wps:wsp>
+                      <wps:cNvSpPr>
+                        <a:spLocks noChangeAspect="1" noChangeArrowheads="1"/>
+                      </wps:cNvSpPr>
+                      <wps:spPr bwMode="auto">
+                        <a:xfrm>
+                          <a:off x="0" y="0"/>
+                          <a:ext cx="304800" cy="304800"/>
+                        </a:xfrm>
+                        <a:prstGeom prst="rect">
+                          <a:avLst/>
+                        </a:prstGeom>
+                        <a:noFill/>
+                        <a:ln>
+                          <a:noFill/>
+                        </a:ln>
+                        <a:extLst>
+                          <a:ext uri="{909E8E84-426E-40DD-AFC4-6F175D3DCCD1}">
+                            <a14:hiddenFill xmlns:a14="http://schemas.microsoft.com/office/drawing/2010/main">
+                              <a:solidFill>
+                                <a:srgbClr val="FFFFFF"/>
+                              </a:solidFill>
+                            </a14:hiddenFill>
+                          </a:ext>
+                          <a:ext uri="{91240B29-F687-4F45-9708-019B960494DF}">
+                            <a14:hiddenLine xmlns:a14="http://schemas.microsoft.com/office/drawing/2010/main" w="9525">
+                              <a:solidFill>
+                                <a:srgbClr val="000000"/>
+                              </a:solidFill>
+                              <a:miter lim="800000"/>
+                              <a:headEnd/>
+                              <a:tailEnd/>
+                            </a14:hiddenLine>
+                          </a:ext>
+                        </a:extLst>
+                      </wps:spPr>
+                      <wps:bodyPr rot="0" vert="horz" wrap="square" lIns="91440" tIns="45720" rIns="91440" bIns="45720" anchor="t" anchorCtr="0" upright="1">
+                        <a:noAutofit/>
+                      </wps:bodyPr>
+                    </wps:wsp>
+                  </a:graphicData>
+                </a:graphic>
+              </wp:inline>
+            </w:drawing>
+          </mc:Choice>
+          <mc:Fallback>
+            <w:pict>
+              <v:rect w14:anchorId="49C3E1FA" id="Rectangle 19" o:spid="_x0000_s1026" style="width:24pt;height:24pt;visibility:visible;mso-wrap-style:square;mso-left-percent:-10001;mso-top-percent:-10001;mso-position-horizontal:absolute;mso-position-horizontal-relative:char;mso-position-vertical:absolute;mso-position-vertical-relative:line;mso-left-percent:-10001;mso-top-percent:-10001;v-text-anchor:top" o:gfxdata="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" filled="f" stroked="f">
+                <o:lock v:ext="edit" aspectratio="t"/>
+                <w10:anchorlock/>
+              </v:rect>
+            </w:pict>
+          </mc:Fallback>
+        </mc:AlternateContent>
+      </w:r>
+    </w:p>
+    <w:p>
+      <w:proofErr w:type="spellStart"/>
+      <w:r>
+        <w:t>firebase.json</w:t>
+      </w:r>
+      <w:proofErr w:type="spellEnd"/>
+      <w:r>
+        <w:t>)</w:t>
+      </w:r>
+    </w:p>
+    <w:p>
+      <w:pPr>
+        <w:numPr>
+          <w:ilvl w:val="0"/>
+          <w:numId w:val="19"/>
+        </w:numPr>
+      </w:pPr>
+      <w:r>
+        <w:rPr>
+          <w:b/>
+          <w:bCs/>
+        </w:rPr>
+        <w:t>Role-Based Access Control</w:t>
+      </w:r>
+      <w:r>
+        <w:t>:</w:t>
+      </w:r>
+    </w:p>
+    <w:p>
+      <w:pPr>
+        <w:numPr>
+          <w:ilvl w:val="1"/>
+          <w:numId w:val="19"/>
+        </w:numPr>
+      </w:pPr>
+      <w:r>
+        <w:rPr>
+          <w:b/>
+          <w:bCs/>
+        </w:rPr>
+        <w:t>Read Access (.read: true)</w:t>
+      </w:r>
+      <w:r>
+        <w:t>: Public/dashboard clients can read live and historical telemetry.</w:t>
+      </w:r>
+    </w:p>
+    <w:p>
+      <w:pPr>
+        <w:numPr>
+          <w:ilvl w:val="1"/>
+          <w:numId w:val="19"/>
+        </w:numPr>
+      </w:pPr>
+      <w:r>
+        <w:rPr>
+          <w:b/>
+          <w:bCs/>
+        </w:rPr>
+        <w:t>Write Access (.write: "auth != null")</w:t>
+      </w:r>
+      <w:r>
+        <w:t>: Restricted strictly to authenticated edge hardware (Esp8266.ino using Firebase Auth) or backend services with token/secret.</w:t>
+      </w:r>
+    </w:p>
+    <w:p>
+      <w:pPr>
+        <w:numPr>
+          <w:ilvl w:val="0"/>
+          <w:numId w:val="19"/>
+        </w:numPr>
+      </w:pPr>
+      <w:r>
+        <w:rPr>
+          <w:b/>
+          <w:bCs/>
+        </w:rPr>
+        <w:t>Strict Biological Data Validation</w:t>
+      </w:r>
+      <w:r>
+        <w:t>:</w:t>
+      </w:r>
+    </w:p>
+    <w:p>
+      <w:pPr>
+        <w:numPr>
+          <w:ilvl w:val="1"/>
+          <w:numId w:val="19"/>
+        </w:numPr>
+      </w:pPr>
+      <w:proofErr w:type="spellStart"/>
+      <w:r>
+        <w:t>ph</w:t>
+      </w:r>
+      <w:proofErr w:type="spellEnd"/>
+      <w:r>
+        <w:t>: Float within $[0.0, 14.0]$.</w:t>
+      </w:r>
+    </w:p>
+    <w:p>
+      <w:pPr>
+        <w:numPr>
+          <w:ilvl w:val="1"/>
+          <w:numId w:val="19"/>
+        </w:numPr>
+      </w:pPr>
+      <w:r>
+        <w:t>temperature: Float within $[-10.0, 60.0]^\</w:t>
+      </w:r>
+      <w:proofErr w:type="spellStart"/>
+      <w:r>
+        <w:t>circ</w:t>
+      </w:r>
+      <w:proofErr w:type="spellEnd"/>
+      <w:r>
+        <w:t>\text{C}$.</w:t>
+      </w:r>
+    </w:p>
+    <w:p>
+      <w:pPr>
+        <w:numPr>
+          <w:ilvl w:val="1"/>
+          <w:numId w:val="19"/>
+        </w:numPr>
+      </w:pPr>
+      <w:r>
+        <w:t>turbidity: Float $\</w:t>
+      </w:r>
+      <w:proofErr w:type="spellStart"/>
+      <w:r>
+        <w:t>ge</w:t>
+      </w:r>
+      <w:proofErr w:type="spellEnd"/>
+      <w:r>
+        <w:t xml:space="preserve"> 0.0\text{ NTU}$.</w:t>
+      </w:r>
+    </w:p>
+    <w:p>
+      <w:pPr>
+        <w:numPr>
+          <w:ilvl w:val="1"/>
+          <w:numId w:val="19"/>
+        </w:numPr>
+      </w:pPr>
+      <w:proofErr w:type="spellStart"/>
+      <w:r>
+        <w:t>ec</w:t>
+      </w:r>
+      <w:proofErr w:type="spellEnd"/>
+      <w:r>
+        <w:t>: Float $\</w:t>
+      </w:r>
+      <w:proofErr w:type="spellStart"/>
+      <w:r>
+        <w:t>ge</w:t>
+      </w:r>
+      <w:proofErr w:type="spellEnd"/>
+      <w:r>
+        <w:t xml:space="preserve"> 0.0\text{ mS/cm}$.</w:t>
+      </w:r>
+    </w:p>
+    <w:p>
+      <w:pPr>
+        <w:numPr>
+          <w:ilvl w:val="1"/>
+          <w:numId w:val="19"/>
+        </w:numPr>
+      </w:pPr>
+      <w:r>
+        <w:t>Rejects unrecognized schema fields ($other: { .validate: false }).</w:t>
+      </w:r>
+    </w:p>
+    <w:p>
+      <w:pPr>
+        <w:numPr>
+          <w:ilvl w:val="0"/>
+          <w:numId w:val="19"/>
+        </w:numPr>
+      </w:pPr>
+      <w:r>
+        <w:rPr>
+          <w:b/>
+          <w:bCs/>
+        </w:rPr>
+        <w:t>High-Performance Query Indexing</w:t>
+      </w:r>
+      <w:r>
+        <w:t>:</w:t>
+      </w:r>
+    </w:p>
+    <w:p>
+      <w:pPr>
+        <w:numPr>
+          <w:ilvl w:val="1"/>
+          <w:numId w:val="19"/>
+        </w:numPr>
+      </w:pPr>
+      <w:r>
+        <w:t>Added ".</w:t>
+      </w:r>
+      <w:proofErr w:type="spellStart"/>
+      <w:r>
+        <w:t>indexOn</w:t>
+      </w:r>
+      <w:proofErr w:type="spellEnd"/>
+      <w:r>
+        <w:t>": ["timestamp"] under /aquaculture/history for chronological queries without database scans.</w:t>
+      </w:r>
+    </w:p>
+    <w:p>
+      <w:pPr>
+        <w:numPr>
+          <w:ilvl w:val="0"/>
+          <w:numId w:val="19"/>
+        </w:numPr>
+      </w:pPr>
+      <w:r>
+        <w:rPr>
+          <w:b/>
+          <w:bCs/>
+        </w:rPr>
+        <w:t>Firebase CLI Configuration</w:t>
+      </w:r>
+      <w:r>
+        <w:t>:</w:t>
+      </w:r>
+    </w:p>
+    <w:p>
+      <w:pPr>
+        <w:numPr>
+          <w:ilvl w:val="1"/>
+          <w:numId w:val="19"/>
+        </w:numPr>
+      </w:pPr>
+      <w:r>
+        <w:t>Created </w:t>
+      </w:r>
+    </w:p>
+    <w:p>
+      <w:r>
+        <mc:AlternateContent>
+          <mc:Choice Requires="wps">
+            <w:drawing>
+              <wp:inline distT="0" distB="0" distL="0" distR="0" wp14:anchorId="7AA53674" wp14:editId="0964FBEB">
+                <wp:extent cx="304800" cy="304800"/>
+                <wp:effectExtent l="0" t="0" r="0" b="0"/>
+                <wp:docPr id="972607016" name="Rectangle 18"/>
+                <wp:cNvGraphicFramePr>
+                  <a:graphicFrameLocks xmlns:a="http://schemas.openxmlformats.org/drawingml/2006/main" noChangeAspect="1"/>
+                </wp:cNvGraphicFramePr>
+                <a:graphic xmlns:a="http://schemas.openxmlformats.org/drawingml/2006/main">
+                  <a:graphicData uri="http://schemas.microsoft.com/office/word/2010/wordprocessingShape">
+                    <wps:wsp>
+                      <wps:cNvSpPr>
+                        <a:spLocks noChangeAspect="1" noChangeArrowheads="1"/>
+                      </wps:cNvSpPr>
+                      <wps:spPr bwMode="auto">
+                        <a:xfrm>
+                          <a:off x="0" y="0"/>
+                          <a:ext cx="304800" cy="304800"/>
+                        </a:xfrm>
+                        <a:prstGeom prst="rect">
+                          <a:avLst/>
+                        </a:prstGeom>
+                        <a:noFill/>
+                        <a:ln>
+                          <a:noFill/>
+                        </a:ln>
+                        <a:extLst>
+                          <a:ext uri="{909E8E84-426E-40DD-AFC4-6F175D3DCCD1}">
+                            <a14:hiddenFill xmlns:a14="http://schemas.microsoft.com/office/drawing/2010/main">
+                              <a:solidFill>
+                                <a:srgbClr val="FFFFFF"/>
+                              </a:solidFill>
+                            </a14:hiddenFill>
+                          </a:ext>
+                          <a:ext uri="{91240B29-F687-4F45-9708-019B960494DF}">
+                            <a14:hiddenLine xmlns:a14="http://schemas.microsoft.com/office/drawing/2010/main" w="9525">
+                              <a:solidFill>
+                                <a:srgbClr val="000000"/>
+                              </a:solidFill>
+                              <a:miter lim="800000"/>
+                              <a:headEnd/>
+                              <a:tailEnd/>
+                            </a14:hiddenLine>
+                          </a:ext>
+                        </a:extLst>
+                      </wps:spPr>
+                      <wps:bodyPr rot="0" vert="horz" wrap="square" lIns="91440" tIns="45720" rIns="91440" bIns="45720" anchor="t" anchorCtr="0" upright="1">
+                        <a:noAutofit/>
+                      </wps:bodyPr>
+                    </wps:wsp>
+                  </a:graphicData>
+                </a:graphic>
+              </wp:inline>
+            </w:drawing>
+          </mc:Choice>
+          <mc:Fallback>
+            <w:pict>
+              <v:rect w14:anchorId="3628E234" id="Rectangle 18" o:spid="_x0000_s1026" style="width:24pt;height:24pt;visibility:visible;mso-wrap-style:square;mso-left-percent:-10001;mso-top-percent:-10001;mso-position-horizontal:absolute;mso-position-horizontal-relative:char;mso-position-vertical:absolute;mso-position-vertical-relative:line;mso-left-percent:-10001;mso-top-percent:-10001;v-text-anchor:top" o:gfxdata="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" filled="f" stroked="f">
+                <o:lock v:ext="edit" aspectratio="t"/>
+                <w10:anchorlock/>
+              </v:rect>
+            </w:pict>
+          </mc:Fallback>
+        </mc:AlternateContent>
+      </w:r>
+    </w:p>
+    <w:p>
+      <w:proofErr w:type="spellStart"/>
+      <w:r>
+        <w:t>firebase.json</w:t>
+      </w:r>
+      <w:proofErr w:type="spellEnd"/>
+      <w:r>
+        <w:t> for 1-command deployment (firebase deploy --only database).</w:t>
+      </w:r>
+    </w:p>
+    <w:p>
+      <w:r>
+        <w:pict w14:anchorId="2F26FE3F">
+          <v:rect id="_x0000_i1124" style="width:271.8pt;height:.75pt" o:hrpct="0" o:hralign="center" o:hrstd="t" o:hr="t" fillcolor="#a0a0a0" stroked="f"/>
+        </w:pict>
+      </w:r>
+    </w:p>
+    <w:p>
+      <w:r>
+        <w:t>2. History Retention &amp; Pruning Engine (</w:t>
+      </w:r>
+    </w:p>
+    <w:p>
+      <w:pPr>
+        <w:rPr>
+          <w:b/>
+          <w:bCs/>
+        </w:rPr>
+      </w:pPr>
+      <w:r>
+        <w:lastRenderedPageBreak/>
+        <mc:AlternateContent>
+          <mc:Choice Requires="wps">
+            <w:drawing>
+              <wp:inline distT="0" distB="0" distL="0" distR="0" wp14:anchorId="05F48557" wp14:editId="7C812B2D">
+                <wp:extent cx="304800" cy="304800"/>
+                <wp:effectExtent l="0" t="0" r="0" b="0"/>
+                <wp:docPr id="541859828" name="Rectangle 17"/>
+                <wp:cNvGraphicFramePr>
+                  <a:graphicFrameLocks xmlns:a="http://schemas.openxmlformats.org/drawingml/2006/main" noChangeAspect="1"/>
+                </wp:cNvGraphicFramePr>
+                <a:graphic xmlns:a="http://schemas.openxmlformats.org/drawingml/2006/main">
+                  <a:graphicData uri="http://schemas.microsoft.com/office/word/2010/wordprocessingShape">
+                    <wps:wsp>
+                      <wps:cNvSpPr>
+                        <a:spLocks noChangeAspect="1" noChangeArrowheads="1"/>
+                      </wps:cNvSpPr>
+                      <wps:spPr bwMode="auto">
+                        <a:xfrm>
+                          <a:off x="0" y="0"/>
+                          <a:ext cx="304800" cy="304800"/>
+                        </a:xfrm>
+                        <a:prstGeom prst="rect">
+                          <a:avLst/>
+                        </a:prstGeom>
+                        <a:noFill/>
+                        <a:ln>
+                          <a:noFill/>
+                        </a:ln>
+                        <a:extLst>
+                          <a:ext uri="{909E8E84-426E-40DD-AFC4-6F175D3DCCD1}">
+                            <a14:hiddenFill xmlns:a14="http://schemas.microsoft.com/office/drawing/2010/main">
+                              <a:solidFill>
+                                <a:srgbClr val="FFFFFF"/>
+                              </a:solidFill>
+                            </a14:hiddenFill>
+                          </a:ext>
+                          <a:ext uri="{91240B29-F687-4F45-9708-019B960494DF}">
+                            <a14:hiddenLine xmlns:a14="http://schemas.microsoft.com/office/drawing/2010/main" w="9525">
+                              <a:solidFill>
+                                <a:srgbClr val="000000"/>
+                              </a:solidFill>
+                              <a:miter lim="800000"/>
+                              <a:headEnd/>
+                              <a:tailEnd/>
+                            </a14:hiddenLine>
+                          </a:ext>
+                        </a:extLst>
+                      </wps:spPr>
+                      <wps:bodyPr rot="0" vert="horz" wrap="square" lIns="91440" tIns="45720" rIns="91440" bIns="45720" anchor="t" anchorCtr="0" upright="1">
+                        <a:noAutofit/>
+                      </wps:bodyPr>
+                    </wps:wsp>
+                  </a:graphicData>
+                </a:graphic>
+              </wp:inline>
+            </w:drawing>
+          </mc:Choice>
+          <mc:Fallback>
+            <w:pict>
+              <v:rect w14:anchorId="79ED4FB2" id="Rectangle 17" o:spid="_x0000_s1026" style="width:24pt;height:24pt;visibility:visible;mso-wrap-style:square;mso-left-percent:-10001;mso-top-percent:-10001;mso-position-horizontal:absolute;mso-position-horizontal-relative:char;mso-position-vertical:absolute;mso-position-vertical-relative:line;mso-left-percent:-10001;mso-top-percent:-10001;v-text-anchor:top" o:gfxdata="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" filled="f" stroked="f">
+                <o:lock v:ext="edit" aspectratio="t"/>
+                <w10:anchorlock/>
+              </v:rect>
+            </w:pict>
+          </mc:Fallback>
+        </mc:AlternateContent>
+      </w:r>
+    </w:p>
+    <w:p>
+      <w:r>
+        <w:t>backend/firebase_retention.py)</w:t>
+      </w:r>
+    </w:p>
+    <w:p>
+      <w:pPr>
+        <w:numPr>
+          <w:ilvl w:val="0"/>
+          <w:numId w:val="20"/>
+        </w:numPr>
+      </w:pPr>
+      <w:r>
+        <w:rPr>
+          <w:b/>
+          <w:bCs/>
+        </w:rPr>
+        <w:t>Two Flexible Retention Strategies</w:t>
+      </w:r>
+      <w:r>
+        <w:t>:</w:t>
+      </w:r>
+    </w:p>
+    <w:p>
+      <w:pPr>
+        <w:numPr>
+          <w:ilvl w:val="1"/>
+          <w:numId w:val="20"/>
+        </w:numPr>
+      </w:pPr>
+      <w:r>
+        <w:rPr>
+          <w:b/>
+          <w:bCs/>
+        </w:rPr>
+        <w:t>Count-based Pruning</w:t>
+      </w:r>
+      <w:r>
+        <w:t>: Automatically retains the latest $N$ records (default: 500 points) and prunes older entries.</w:t>
+      </w:r>
+    </w:p>
+    <w:p>
+      <w:pPr>
+        <w:numPr>
+          <w:ilvl w:val="1"/>
+          <w:numId w:val="20"/>
+        </w:numPr>
+      </w:pPr>
+      <w:r>
+        <w:rPr>
+          <w:b/>
+          <w:bCs/>
+        </w:rPr>
+        <w:t>TTL / Age-based Pruning</w:t>
+      </w:r>
+      <w:r>
+        <w:t>: Can prune data points older than $X$ hours/days.</w:t>
+      </w:r>
+    </w:p>
+    <w:p>
+      <w:pPr>
+        <w:numPr>
+          <w:ilvl w:val="0"/>
+          <w:numId w:val="20"/>
+        </w:numPr>
+      </w:pPr>
+      <w:r>
+        <w:rPr>
+          <w:b/>
+          <w:bCs/>
+        </w:rPr>
+        <w:t>Batch Multi-Path Updates</w:t>
+      </w:r>
+      <w:r>
+        <w:t>: Uses Firebase REST multi-path patching ({ key1: null, key2: null }) to delete excess keys in a single network transaction.</w:t>
+      </w:r>
+    </w:p>
+    <w:p>
+      <w:pPr>
+        <w:numPr>
+          <w:ilvl w:val="0"/>
+          <w:numId w:val="20"/>
+        </w:numPr>
+      </w:pPr>
+      <w:r>
+        <w:rPr>
+          <w:b/>
+          <w:bCs/>
+        </w:rPr>
+        <w:t>Automated Daemon Worker</w:t>
+      </w:r>
+      <w:r>
+        <w:t>: Runs in the background on an hourly schedule to ensure database size stays capped without manual intervention.</w:t>
+      </w:r>
+    </w:p>
+    <w:p>
+      <w:pPr>
+        <w:numPr>
+          <w:ilvl w:val="0"/>
+          <w:numId w:val="20"/>
+        </w:numPr>
+      </w:pPr>
+      <w:r>
+        <w:rPr>
+          <w:b/>
+          <w:bCs/>
+        </w:rPr>
+        <w:t>CLI Utility</w:t>
+      </w:r>
+      <w:r>
+        <w:t>: Supports manual checks or scheduled Windows Task Scheduler tasks:</w:t>
+      </w:r>
+    </w:p>
+    <w:p>
+      <w:proofErr w:type="spellStart"/>
+      <w:r>
+        <w:t>powershell</w:t>
+      </w:r>
+      <w:proofErr w:type="spellEnd"/>
+    </w:p>
+    <w:p>
+      <w:r>
+        <w:t>python backend/firebase_retention.py --status</w:t>
+      </w:r>
+    </w:p>
+    <w:p>
+      <w:r>
+        <w:t>python backend/firebase_retention.py --prune --max-records 500</w:t>
+      </w:r>
+    </w:p>
+    <w:p>
+      <w:r>
+        <w:pict w14:anchorId="10AC14E7">
+          <v:rect id="_x0000_i1126" style="width:271.8pt;height:.75pt" o:hrpct="0" o:hralign="center" o:hrstd="t" o:hr="t" fillcolor="#a0a0a0" stroked="f"/>
+        </w:pict>
+      </w:r>
+    </w:p>
+    <w:p>
+      <w:r>
+        <w:t>3. Backend REST Integration (</w:t>
+      </w:r>
+    </w:p>
+    <w:p>
+      <w:pPr>
+        <w:rPr>
+          <w:b/>
+          <w:bCs/>
+        </w:rPr>
+      </w:pPr>
+      <w:r>
+        <mc:AlternateContent>
+          <mc:Choice Requires="wps">
+            <w:drawing>
+              <wp:inline distT="0" distB="0" distL="0" distR="0" wp14:anchorId="34AAA188" wp14:editId="6D34FDC5">
+                <wp:extent cx="304800" cy="304800"/>
+                <wp:effectExtent l="0" t="0" r="0" b="0"/>
+                <wp:docPr id="1827059676" name="Rectangle 16"/>
+                <wp:cNvGraphicFramePr>
+                  <a:graphicFrameLocks xmlns:a="http://schemas.openxmlformats.org/drawingml/2006/main" noChangeAspect="1"/>
+                </wp:cNvGraphicFramePr>
+                <a:graphic xmlns:a="http://schemas.openxmlformats.org/drawingml/2006/main">
+                  <a:graphicData uri="http://schemas.microsoft.com/office/word/2010/wordprocessingShape">
+                    <wps:wsp>
+                      <wps:cNvSpPr>
+                        <a:spLocks noChangeAspect="1" noChangeArrowheads="1"/>
+                      </wps:cNvSpPr>
+                      <wps:spPr bwMode="auto">
+                        <a:xfrm>
+                          <a:off x="0" y="0"/>
+                          <a:ext cx="304800" cy="304800"/>
+                        </a:xfrm>
+                        <a:prstGeom prst="rect">
+                          <a:avLst/>
+                        </a:prstGeom>
+                        <a:noFill/>
+                        <a:ln>
+                          <a:noFill/>
+                        </a:ln>
+                        <a:extLst>
+                          <a:ext uri="{909E8E84-426E-40DD-AFC4-6F175D3DCCD1}">
+                            <a14:hiddenFill xmlns:a14="http://schemas.microsoft.com/office/drawing/2010/main">
+                              <a:solidFill>
+                                <a:srgbClr val="FFFFFF"/>
+                              </a:solidFill>
+                            </a14:hiddenFill>
+                          </a:ext>
+                          <a:ext uri="{91240B29-F687-4F45-9708-019B960494DF}">
+                            <a14:hiddenLine xmlns:a14="http://schemas.microsoft.com/office/drawing/2010/main" w="9525">
+                              <a:solidFill>
+                                <a:srgbClr val="000000"/>
+                              </a:solidFill>
+                              <a:miter lim="800000"/>
+                              <a:headEnd/>
+                              <a:tailEnd/>
+                            </a14:hiddenLine>
+                          </a:ext>
+                        </a:extLst>
+                      </wps:spPr>
+                      <wps:bodyPr rot="0" vert="horz" wrap="square" lIns="91440" tIns="45720" rIns="91440" bIns="45720" anchor="t" anchorCtr="0" upright="1">
+                        <a:noAutofit/>
+                      </wps:bodyPr>
+                    </wps:wsp>
+                  </a:graphicData>
+                </a:graphic>
+              </wp:inline>
+            </w:drawing>
+          </mc:Choice>
+          <mc:Fallback>
+            <w:pict>
+              <v:rect w14:anchorId="4844929D" id="Rectangle 16" o:spid="_x0000_s1026" style="width:24pt;height:24pt;visibility:visible;mso-wrap-style:square;mso-left-percent:-10001;mso-top-percent:-10001;mso-position-horizontal:absolute;mso-position-horizontal-relative:char;mso-position-vertical:absolute;mso-position-vertical-relative:line;mso-left-percent:-10001;mso-top-percent:-10001;v-text-anchor:top" o:gfxdata="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" filled="f" stroked="f">
+                <o:lock v:ext="edit" aspectratio="t"/>
+                <w10:anchorlock/>
+              </v:rect>
+            </w:pict>
+          </mc:Fallback>
+        </mc:AlternateContent>
+      </w:r>
+    </w:p>
+    <w:p>
+      <w:r>
+        <w:t>backend/app.py)</w:t>
+      </w:r>
+    </w:p>
+    <w:p>
+      <w:r>
+        <w:t>Added real-time history and retention endpoints to the Flask server:</w:t>
+      </w:r>
+    </w:p>
+    <w:p>
+      <w:pPr>
+        <w:numPr>
+          <w:ilvl w:val="0"/>
+          <w:numId w:val="21"/>
+        </w:numPr>
+      </w:pPr>
+      <w:r>
+        <w:t>GET /firebase/</w:t>
+      </w:r>
+      <w:proofErr w:type="spellStart"/>
+      <w:r>
+        <w:t>history?limit</w:t>
+      </w:r>
+      <w:proofErr w:type="spellEnd"/>
+      <w:r>
+        <w:t>=100 — Fetches chronological telemetry points.</w:t>
+      </w:r>
+    </w:p>
+    <w:p>
+      <w:pPr>
+        <w:numPr>
+          <w:ilvl w:val="0"/>
+          <w:numId w:val="21"/>
+        </w:numPr>
+      </w:pPr>
+      <w:r>
+        <w:t>POST /firebase/history/push — Pushes telemetry points to Firebase history.</w:t>
+      </w:r>
+    </w:p>
+    <w:p>
+      <w:pPr>
+        <w:numPr>
+          <w:ilvl w:val="0"/>
+          <w:numId w:val="21"/>
+        </w:numPr>
+      </w:pPr>
+      <w:r>
+        <w:t>GET /firebase/retention/status — Returns database storage count, time span, and health.</w:t>
+      </w:r>
+    </w:p>
+    <w:p>
+      <w:pPr>
+        <w:numPr>
+          <w:ilvl w:val="0"/>
+          <w:numId w:val="21"/>
+        </w:numPr>
+      </w:pPr>
+      <w:r>
+        <w:t>POST /firebase/retention/prune — Triggers on-demand pruning.</w:t>
+      </w:r>
+    </w:p>
+    <w:p>
+      <w:r>
+        <w:pict w14:anchorId="1103C06A">
+          <v:rect id="_x0000_i1128" style="width:271.8pt;height:.75pt" o:hrpct="0" o:hralign="center" o:hrstd="t" o:hr="t" fillcolor="#a0a0a0" stroked="f"/>
+        </w:pict>
+      </w:r>
+    </w:p>
+    <w:p>
+      <w:r>
+        <w:t>4. Edge Hardware Firmware Gateway (</w:t>
+      </w:r>
+    </w:p>
+    <w:p>
+      <w:pPr>
+        <w:rPr>
+          <w:b/>
+          <w:bCs/>
+        </w:rPr>
+      </w:pPr>
+      <w:r>
+        <mc:AlternateContent>
+          <mc:Choice Requires="wps">
+            <w:drawing>
+              <wp:inline distT="0" distB="0" distL="0" distR="0" wp14:anchorId="57F96C76" wp14:editId="16196997">
+                <wp:extent cx="304800" cy="304800"/>
+                <wp:effectExtent l="0" t="0" r="0" b="0"/>
+                <wp:docPr id="214466241" name="Rectangle 15"/>
+                <wp:cNvGraphicFramePr>
+                  <a:graphicFrameLocks xmlns:a="http://schemas.openxmlformats.org/drawingml/2006/main" noChangeAspect="1"/>
+                </wp:cNvGraphicFramePr>
+                <a:graphic xmlns:a="http://schemas.openxmlformats.org/drawingml/2006/main">
+                  <a:graphicData uri="http://schemas.microsoft.com/office/word/2010/wordprocessingShape">
+                    <wps:wsp>
+                      <wps:cNvSpPr>
+                        <a:spLocks noChangeAspect="1" noChangeArrowheads="1"/>
+                      </wps:cNvSpPr>
+                      <wps:spPr bwMode="auto">
+                        <a:xfrm>
+                          <a:off x="0" y="0"/>
+                          <a:ext cx="304800" cy="304800"/>
+                        </a:xfrm>
+                        <a:prstGeom prst="rect">
+                          <a:avLst/>
+                        </a:prstGeom>
+                        <a:noFill/>
+                        <a:ln>
+                          <a:noFill/>
+                        </a:ln>
+                        <a:extLst>
+                          <a:ext uri="{909E8E84-426E-40DD-AFC4-6F175D3DCCD1}">
+                            <a14:hiddenFill xmlns:a14="http://schemas.microsoft.com/office/drawing/2010/main">
+                              <a:solidFill>
+                                <a:srgbClr val="FFFFFF"/>
+                              </a:solidFill>
+                            </a14:hiddenFill>
+                          </a:ext>
+                          <a:ext uri="{91240B29-F687-4F45-9708-019B960494DF}">
+                            <a14:hiddenLine xmlns:a14="http://schemas.microsoft.com/office/drawing/2010/main" w="9525">
+                              <a:solidFill>
+                                <a:srgbClr val="000000"/>
+                              </a:solidFill>
+                              <a:miter lim="800000"/>
+                              <a:headEnd/>
+                              <a:tailEnd/>
+                            </a14:hiddenLine>
+                          </a:ext>
+                        </a:extLst>
+                      </wps:spPr>
+                      <wps:bodyPr rot="0" vert="horz" wrap="square" lIns="91440" tIns="45720" rIns="91440" bIns="45720" anchor="t" anchorCtr="0" upright="1">
+                        <a:noAutofit/>
+                      </wps:bodyPr>
+                    </wps:wsp>
+                  </a:graphicData>
+                </a:graphic>
+              </wp:inline>
+            </w:drawing>
+          </mc:Choice>
+          <mc:Fallback>
+            <w:pict>
+              <v:rect w14:anchorId="612FC910" id="Rectangle 15" o:spid="_x0000_s1026" style="width:24pt;height:24pt;visibility:visible;mso-wrap-style:square;mso-left-percent:-10001;mso-top-percent:-10001;mso-position-horizontal:absolute;mso-position-horizontal-relative:char;mso-position-vertical:absolute;mso-position-vertical-relative:line;mso-left-percent:-10001;mso-top-percent:-10001;v-text-anchor:top" o:gfxdata="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" filled="f" stroked="f">
+                <o:lock v:ext="edit" aspectratio="t"/>
+                <w10:anchorlock/>
+              </v:rect>
+            </w:pict>
+          </mc:Fallback>
+        </mc:AlternateContent>
+      </w:r>
+    </w:p>
+    <w:p>
+      <w:r>
+        <w:t>backend/Esp8266.ino)</w:t>
+      </w:r>
+    </w:p>
+    <w:p>
+      <w:pPr>
+        <w:numPr>
+          <w:ilvl w:val="0"/>
+          <w:numId w:val="22"/>
+        </w:numPr>
+      </w:pPr>
+      <w:r>
+        <w:t>Maintains live updates to /aquaculture/sensors every 5 seconds.</w:t>
+      </w:r>
+    </w:p>
+    <w:p>
+      <w:pPr>
+        <w:numPr>
+          <w:ilvl w:val="0"/>
+          <w:numId w:val="22"/>
+        </w:numPr>
+      </w:pPr>
+      <w:r>
+        <w:t>Automatically archives telemetry points to /aquaculture/history via </w:t>
+      </w:r>
+      <w:proofErr w:type="spellStart"/>
+      <w:r>
+        <w:t>Firebase.pushJSON</w:t>
+      </w:r>
+      <w:proofErr w:type="spellEnd"/>
+      <w:r>
+        <w:t> every 60 seconds (HISTORY_PUSH_INTERVAL_MS).</w:t>
+      </w:r>
+    </w:p>
+    <w:p>
+      <w:r>
+        <w:pict w14:anchorId="16C2CF6C">
+          <v:rect id="_x0000_i1130" style="width:271.8pt;height:.75pt" o:hrpct="0" o:hralign="center" o:hrstd="t" o:hr="t" fillcolor="#a0a0a0" stroked="f"/>
+        </w:pict>
+      </w:r>
+    </w:p>
+    <w:p>
+      <w:r>
+        <w:lastRenderedPageBreak/>
+        <w:t>5. Frontend Initial History Hydration (</w:t>
+      </w:r>
+    </w:p>
+    <w:p>
+      <w:pPr>
+        <w:rPr>
+          <w:b/>
+          <w:bCs/>
+        </w:rPr>
+      </w:pPr>
+      <w:r>
+        <mc:AlternateContent>
+          <mc:Choice Requires="wps">
+            <w:drawing>
+              <wp:inline distT="0" distB="0" distL="0" distR="0" wp14:anchorId="4A9C32EF" wp14:editId="3B5B2F9B">
+                <wp:extent cx="304800" cy="304800"/>
+                <wp:effectExtent l="0" t="0" r="0" b="0"/>
+                <wp:docPr id="566992570" name="Rectangle 14"/>
+                <wp:cNvGraphicFramePr>
+                  <a:graphicFrameLocks xmlns:a="http://schemas.openxmlformats.org/drawingml/2006/main" noChangeAspect="1"/>
+                </wp:cNvGraphicFramePr>
+                <a:graphic xmlns:a="http://schemas.openxmlformats.org/drawingml/2006/main">
+                  <a:graphicData uri="http://schemas.microsoft.com/office/word/2010/wordprocessingShape">
+                    <wps:wsp>
+                      <wps:cNvSpPr>
+                        <a:spLocks noChangeAspect="1" noChangeArrowheads="1"/>
+                      </wps:cNvSpPr>
+                      <wps:spPr bwMode="auto">
+                        <a:xfrm>
+                          <a:off x="0" y="0"/>
+                          <a:ext cx="304800" cy="304800"/>
+                        </a:xfrm>
+                        <a:prstGeom prst="rect">
+                          <a:avLst/>
+                        </a:prstGeom>
+                        <a:noFill/>
+                        <a:ln>
+                          <a:noFill/>
+                        </a:ln>
+                        <a:extLst>
+                          <a:ext uri="{909E8E84-426E-40DD-AFC4-6F175D3DCCD1}">
+                            <a14:hiddenFill xmlns:a14="http://schemas.microsoft.com/office/drawing/2010/main">
+                              <a:solidFill>
+                                <a:srgbClr val="FFFFFF"/>
+                              </a:solidFill>
+                            </a14:hiddenFill>
+                          </a:ext>
+                          <a:ext uri="{91240B29-F687-4F45-9708-019B960494DF}">
+                            <a14:hiddenLine xmlns:a14="http://schemas.microsoft.com/office/drawing/2010/main" w="9525">
+                              <a:solidFill>
+                                <a:srgbClr val="000000"/>
+                              </a:solidFill>
+                              <a:miter lim="800000"/>
+                              <a:headEnd/>
+                              <a:tailEnd/>
+                            </a14:hiddenLine>
+                          </a:ext>
+                        </a:extLst>
+                      </wps:spPr>
+                      <wps:bodyPr rot="0" vert="horz" wrap="square" lIns="91440" tIns="45720" rIns="91440" bIns="45720" anchor="t" anchorCtr="0" upright="1">
+                        <a:noAutofit/>
+                      </wps:bodyPr>
+                    </wps:wsp>
+                  </a:graphicData>
+                </a:graphic>
+              </wp:inline>
+            </w:drawing>
+          </mc:Choice>
+          <mc:Fallback>
+            <w:pict>
+              <v:rect w14:anchorId="70D3E5FB" id="Rectangle 14" o:spid="_x0000_s1026" style="width:24pt;height:24pt;visibility:visible;mso-wrap-style:square;mso-left-percent:-10001;mso-top-percent:-10001;mso-position-horizontal:absolute;mso-position-horizontal-relative:char;mso-position-vertical:absolute;mso-position-vertical-relative:line;mso-left-percent:-10001;mso-top-percent:-10001;v-text-anchor:top" o:gfxdata="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" filled="f" stroked="f">
+                <o:lock v:ext="edit" aspectratio="t"/>
+                <w10:anchorlock/>
+              </v:rect>
+            </w:pict>
+          </mc:Fallback>
+        </mc:AlternateContent>
+      </w:r>
+    </w:p>
+    <w:p>
+      <w:r>
+        <w:t>frontend/</w:t>
+      </w:r>
+      <w:proofErr w:type="spellStart"/>
+      <w:r>
+        <w:t>src</w:t>
+      </w:r>
+      <w:proofErr w:type="spellEnd"/>
+      <w:r>
+        <w:t>/components/</w:t>
+      </w:r>
+      <w:proofErr w:type="spellStart"/>
+      <w:r>
+        <w:t>AnalyticsCharts.jsx</w:t>
+      </w:r>
+      <w:proofErr w:type="spellEnd"/>
+      <w:r>
+        <w:t>)</w:t>
+      </w:r>
+    </w:p>
+    <w:p>
+      <w:pPr>
+        <w:numPr>
+          <w:ilvl w:val="0"/>
+          <w:numId w:val="23"/>
+        </w:numPr>
+      </w:pPr>
+      <w:r>
+        <w:t>On component mount, the charts immediately query the latest 60 points from /aquaculture/history (query(ref(</w:t>
+      </w:r>
+      <w:proofErr w:type="spellStart"/>
+      <w:r>
+        <w:t>db</w:t>
+      </w:r>
+      <w:proofErr w:type="spellEnd"/>
+      <w:r>
+        <w:t xml:space="preserve">, '/aquaculture/history'), </w:t>
+      </w:r>
+      <w:proofErr w:type="spellStart"/>
+      <w:r>
+        <w:t>limitToLast</w:t>
+      </w:r>
+      <w:proofErr w:type="spellEnd"/>
+      <w:r>
+        <w:t>(60))), allowing the charts to render past trend curves upon initial page load without waiting for incoming live points.</w:t>
+      </w:r>
+    </w:p>
+    <w:p>
+      <w:r>
+        <w:pict w14:anchorId="655AC65A">
+          <v:rect id="_x0000_i1132" style="width:271.8pt;height:.75pt" o:hrpct="0" o:hralign="center" o:hrstd="t" o:hr="t" fillcolor="#a0a0a0" stroked="f"/>
+        </w:pict>
+      </w:r>
+    </w:p>
+    <w:p>
+      <w:r>
+        <w:t>6. Test Suite Verification (</w:t>
+      </w:r>
+    </w:p>
+    <w:p>
+      <w:pPr>
+        <w:rPr>
+          <w:b/>
+          <w:bCs/>
+        </w:rPr>
+      </w:pPr>
+      <w:r>
+        <mc:AlternateContent>
+          <mc:Choice Requires="wps">
+            <w:drawing>
+              <wp:inline distT="0" distB="0" distL="0" distR="0" wp14:anchorId="66784821" wp14:editId="7BAA0679">
+                <wp:extent cx="304800" cy="304800"/>
+                <wp:effectExtent l="0" t="0" r="0" b="0"/>
+                <wp:docPr id="624614477" name="Rectangle 13"/>
+                <wp:cNvGraphicFramePr>
+                  <a:graphicFrameLocks xmlns:a="http://schemas.openxmlformats.org/drawingml/2006/main" noChangeAspect="1"/>
+                </wp:cNvGraphicFramePr>
+                <a:graphic xmlns:a="http://schemas.openxmlformats.org/drawingml/2006/main">
+                  <a:graphicData uri="http://schemas.microsoft.com/office/word/2010/wordprocessingShape">
+                    <wps:wsp>
+                      <wps:cNvSpPr>
+                        <a:spLocks noChangeAspect="1" noChangeArrowheads="1"/>
+                      </wps:cNvSpPr>
+                      <wps:spPr bwMode="auto">
+                        <a:xfrm>
+                          <a:off x="0" y="0"/>
+                          <a:ext cx="304800" cy="304800"/>
+                        </a:xfrm>
+                        <a:prstGeom prst="rect">
+                          <a:avLst/>
+                        </a:prstGeom>
+                        <a:noFill/>
+                        <a:ln>
+                          <a:noFill/>
+                        </a:ln>
+                        <a:extLst>
+                          <a:ext uri="{909E8E84-426E-40DD-AFC4-6F175D3DCCD1}">
+                            <a14:hiddenFill xmlns:a14="http://schemas.microsoft.com/office/drawing/2010/main">
+                              <a:solidFill>
+                                <a:srgbClr val="FFFFFF"/>
+                              </a:solidFill>
+                            </a14:hiddenFill>
+                          </a:ext>
+                          <a:ext uri="{91240B29-F687-4F45-9708-019B960494DF}">
+                            <a14:hiddenLine xmlns:a14="http://schemas.microsoft.com/office/drawing/2010/main" w="9525">
+                              <a:solidFill>
+                                <a:srgbClr val="000000"/>
+                              </a:solidFill>
+                              <a:miter lim="800000"/>
+                              <a:headEnd/>
+                              <a:tailEnd/>
+                            </a14:hiddenLine>
+                          </a:ext>
+                        </a:extLst>
+                      </wps:spPr>
+                      <wps:bodyPr rot="0" vert="horz" wrap="square" lIns="91440" tIns="45720" rIns="91440" bIns="45720" anchor="t" anchorCtr="0" upright="1">
+                        <a:noAutofit/>
+                      </wps:bodyPr>
+                    </wps:wsp>
+                  </a:graphicData>
+                </a:graphic>
+              </wp:inline>
+            </w:drawing>
+          </mc:Choice>
+          <mc:Fallback>
+            <w:pict>
+              <v:rect w14:anchorId="40CFA61B" id="Rectangle 13" o:spid="_x0000_s1026" style="width:24pt;height:24pt;visibility:visible;mso-wrap-style:square;mso-left-percent:-10001;mso-top-percent:-10001;mso-position-horizontal:absolute;mso-position-horizontal-relative:char;mso-position-vertical:absolute;mso-position-vertical-relative:line;mso-left-percent:-10001;mso-top-percent:-10001;v-text-anchor:top" o:gfxdata="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" filled="f" stroked="f">
+                <o:lock v:ext="edit" aspectratio="t"/>
+                <w10:anchorlock/>
+              </v:rect>
+            </w:pict>
+          </mc:Fallback>
+        </mc:AlternateContent>
+      </w:r>
+    </w:p>
+    <w:p>
+      <w:r>
+        <w:t>backend/test_phase5_retention.py)</w:t>
+      </w:r>
+    </w:p>
+    <w:p>
+      <w:pPr>
+        <w:numPr>
+          <w:ilvl w:val="0"/>
+          <w:numId w:val="24"/>
+        </w:numPr>
+      </w:pPr>
+      <w:r>
+        <w:t>Ran full test suite covering rules schema validation, chronological pruning calculations, TTL expired item recognition, mock multi-path deletion, and Flask endpoint validation:</w:t>
+      </w:r>
+    </w:p>
+    <w:p>
+      <w:r>
+        <w:t>Ran 7 tests in 6.081s — OK</w:t>
+      </w:r>
+    </w:p>
+    <w:p>
+      <w:r>
+        <w:pict w14:anchorId="2F74073C">
+          <v:rect id="_x0000_i1134" style="width:271.8pt;height:.75pt" o:hrpct="0" o:hralign="center" o:hrstd="t" o:hr="t" fillcolor="#a0a0a0" stroked="f"/>
+        </w:pict>
+      </w:r>
+    </w:p>
+    <w:p>
+      <w:r>
+        <w:t>Progress Tracking</w:t>
+      </w:r>
+    </w:p>
+    <w:p>
+      <w:r>
+        <w:t>All items in </w:t>
+      </w:r>
+      <w:r>
+        <w:rPr>
+          <w:b/>
+          <w:bCs/>
+        </w:rPr>
+        <w:t>Phase 5</w:t>
+      </w:r>
+      <w:r>
+        <w:t> have been completed in </w:t>
+      </w:r>
+    </w:p>
+    <w:p>
+      <w:r>
+        <mc:AlternateContent>
+          <mc:Choice Requires="wps">
+            <w:drawing>
+              <wp:inline distT="0" distB="0" distL="0" distR="0" wp14:anchorId="11465C32" wp14:editId="5ECCD78E">
+                <wp:extent cx="304800" cy="304800"/>
+                <wp:effectExtent l="0" t="0" r="0" b="0"/>
+                <wp:docPr id="1160776284" name="Rectangle 12"/>
+                <wp:cNvGraphicFramePr>
+                  <a:graphicFrameLocks xmlns:a="http://schemas.openxmlformats.org/drawingml/2006/main" noChangeAspect="1"/>
+                </wp:cNvGraphicFramePr>
+                <a:graphic xmlns:a="http://schemas.openxmlformats.org/drawingml/2006/main">
+                  <a:graphicData uri="http://schemas.microsoft.com/office/word/2010/wordprocessingShape">
+                    <wps:wsp>
+                      <wps:cNvSpPr>
+                        <a:spLocks noChangeAspect="1" noChangeArrowheads="1"/>
+                      </wps:cNvSpPr>
+                      <wps:spPr bwMode="auto">
+                        <a:xfrm>
+                          <a:off x="0" y="0"/>
+                          <a:ext cx="304800" cy="304800"/>
+                        </a:xfrm>
+                        <a:prstGeom prst="rect">
+                          <a:avLst/>
+                        </a:prstGeom>
+                        <a:noFill/>
+                        <a:ln>
+                          <a:noFill/>
+                        </a:ln>
+                        <a:extLst>
+                          <a:ext uri="{909E8E84-426E-40DD-AFC4-6F175D3DCCD1}">
+                            <a14:hiddenFill xmlns:a14="http://schemas.microsoft.com/office/drawing/2010/main">
+                              <a:solidFill>
+                                <a:srgbClr val="FFFFFF"/>
+                              </a:solidFill>
+                            </a14:hiddenFill>
+                          </a:ext>
+                          <a:ext uri="{91240B29-F687-4F45-9708-019B960494DF}">
+                            <a14:hiddenLine xmlns:a14="http://schemas.microsoft.com/office/drawing/2010/main" w="9525">
+                              <a:solidFill>
+                                <a:srgbClr val="000000"/>
+                              </a:solidFill>
+                              <a:miter lim="800000"/>
+                              <a:headEnd/>
+                              <a:tailEnd/>
+                            </a14:hiddenLine>
+                          </a:ext>
+                        </a:extLst>
+                      </wps:spPr>
+                      <wps:bodyPr rot="0" vert="horz" wrap="square" lIns="91440" tIns="45720" rIns="91440" bIns="45720" anchor="t" anchorCtr="0" upright="1">
+                        <a:noAutofit/>
+                      </wps:bodyPr>
+                    </wps:wsp>
+                  </a:graphicData>
+                </a:graphic>
+              </wp:inline>
+            </w:drawing>
+          </mc:Choice>
+          <mc:Fallback>
+            <w:pict>
+              <v:rect w14:anchorId="674F2504" id="Rectangle 12" o:spid="_x0000_s1026" style="width:24pt;height:24pt;visibility:visible;mso-wrap-style:square;mso-left-percent:-10001;mso-top-percent:-10001;mso-position-horizontal:absolute;mso-position-horizontal-relative:char;mso-position-vertical:absolute;mso-position-vertical-relative:line;mso-left-percent:-10001;mso-top-percent:-10001;v-text-anchor:top" o:gfxdata="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" filled="f" stroked="f">
+                <o:lock v:ext="edit" aspectratio="t"/>
+                <w10:anchorlock/>
+              </v:rect>
+            </w:pict>
+          </mc:Fallback>
+        </mc:AlternateContent>
+      </w:r>
+    </w:p>
+    <w:p>
+      <w:r>
+        <w:t>TODOS.md. We are ready to proceed to </w:t>
+      </w:r>
+      <w:r>
+        <w:rPr>
+          <w:b/>
+          <w:bCs/>
+        </w:rPr>
+        <w:t>Phase 6: System Calibration &amp; Integration Testing</w:t>
+      </w:r>
+      <w:r>
+        <w:t> whenever you are ready!</w:t>
       </w:r>
     </w:p>
     <w:p/>
@@ -8010,6 +9412,304 @@
 <file path=word/numbering.xml><?xml version="1.0" encoding="utf-8"?>
 <w:numbering xmlns:wpc="http://schemas.microsoft.com/office/word/2010/wordprocessingCanvas" xmlns:cx="http://schemas.microsoft.com/office/drawing/2014/chartex" xmlns:cx1="http://schemas.microsoft.com/office/drawing/2015/9/8/chartex" xmlns:cx2="http://schemas.microsoft.com/office/drawing/2015/10/21/chartex" xmlns:cx3="http://schemas.microsoft.com/office/drawing/2016/5/9/chartex" xmlns:cx4="http://schemas.microsoft.com/office/drawing/2016/5/10/chartex" xmlns:cx5="http://schemas.microsoft.com/office/drawing/2016/5/11/chartex" xmlns:cx6="http://schemas.microsoft.com/office/drawing/2016/5/12/chartex" xmlns:cx7="http://schemas.microsoft.com/office/drawing/2016/5/13/chartex" xmlns:cx8="http://schemas.microsoft.com/office/drawing/2016/5/14/chartex" xmlns:mc="http://schemas.openxmlformats.org/markup-compatibility/2006" xmlns:aink="http://schemas.microsoft.com/office/drawing/2016/ink" xmlns:am3d="http://schemas.microsoft.com/office/drawing/2017/model3d" xmlns:o="urn:schemas-microsoft-com:office:office" xmlns:oel="http://schemas.microsoft.com/office/2019/extlst" xmlns:r="http://schemas.openxmlformats.org/officeDocument/2006/relationships" xmlns:m="http://schemas.openxmlformats.org/officeDocument/2006/math" xmlns:v="urn:schemas-microsoft-com:vml" xmlns:wp14="http://schemas.microsoft.com/office/word/2010/wordprocessingDrawing" xmlns:wp="http://schemas.openxmlformats.org/drawingml/2006/wordprocessingDrawing" xmlns:w10="urn:schemas-microsoft-com:office:word" xmlns:w="http://schemas.openxmlformats.org/wordprocessingml/2006/main" xmlns:w14="http://schemas.microsoft.com/office/word/2010/wordml" xmlns:w15="http://schemas.microsoft.com/office/word/2012/wordml" xmlns:w16cex="http://schemas.microsoft.com/office/word/2018/wordml/cex" xmlns:w16cid="http://schemas.microsoft.com/office/word/2016/wordml/cid" xmlns:w16="http://schemas.microsoft.com/office/word/2018/wordml" xmlns:w16du="http://schemas.microsoft.com/office/word/2023/wordml/word16du" xmlns:w16sdtdh="http://schemas.microsoft.com/office/word/2020/wordml/sdtdatahash" xmlns:w16sdtfl="http://schemas.microsoft.com/office/word/2024/wordml/sdtformatlock" xmlns:w16se="http://schemas.microsoft.com/office/word/2015/wordml/symex" xmlns:wpg="http://schemas.microsoft.com/office/word/2010/wordprocessingGroup" xmlns:wpi="http://schemas.microsoft.com/office/word/2010/wordprocessingInk" xmlns:wne="http://schemas.microsoft.com/office/word/2006/wordml" xmlns:wps="http://schemas.microsoft.com/office/word/2010/wordprocessingShape" mc:Ignorable="w14 w15 w16se w16cid w16 w16cex w16sdtdh w16sdtfl w16du wp14">
   <w:abstractNum w:abstractNumId="0" w15:restartNumberingAfterBreak="0">
+    <w:nsid w:val="0AEB1A75"/>
+    <w:multiLevelType w:val="multilevel"/>
+    <w:tmpl w:val="83F82508"/>
+    <w:lvl w:ilvl="0">
+      <w:start w:val="1"/>
+      <w:numFmt w:val="bullet"/>
+      <w:lvlText w:val=""/>
+      <w:lvlJc w:val="left"/>
+      <w:pPr>
+        <w:tabs>
+          <w:tab w:val="num" w:pos="720"/>
+        </w:tabs>
+        <w:ind w:left="720" w:hanging="360"/>
+      </w:pPr>
+      <w:rPr>
+        <w:rFonts w:ascii="Symbol" w:hAnsi="Symbol" w:hint="default"/>
+        <w:sz w:val="20"/>
+      </w:rPr>
+    </w:lvl>
+    <w:lvl w:ilvl="1" w:tentative="1">
+      <w:start w:val="1"/>
+      <w:numFmt w:val="bullet"/>
+      <w:lvlText w:val=""/>
+      <w:lvlJc w:val="left"/>
+      <w:pPr>
+        <w:tabs>
+          <w:tab w:val="num" w:pos="1440"/>
+        </w:tabs>
+        <w:ind w:left="1440" w:hanging="360"/>
+      </w:pPr>
+      <w:rPr>
+        <w:rFonts w:ascii="Symbol" w:hAnsi="Symbol" w:hint="default"/>
+        <w:sz w:val="20"/>
+      </w:rPr>
+    </w:lvl>
+    <w:lvl w:ilvl="2" w:tentative="1">
+      <w:start w:val="1"/>
+      <w:numFmt w:val="bullet"/>
+      <w:lvlText w:val=""/>
+      <w:lvlJc w:val="left"/>
+      <w:pPr>
+        <w:tabs>
+          <w:tab w:val="num" w:pos="2160"/>
+        </w:tabs>
+        <w:ind w:left="2160" w:hanging="360"/>
+      </w:pPr>
+      <w:rPr>
+        <w:rFonts w:ascii="Symbol" w:hAnsi="Symbol" w:hint="default"/>
+        <w:sz w:val="20"/>
+      </w:rPr>
+    </w:lvl>
+    <w:lvl w:ilvl="3" w:tentative="1">
+      <w:start w:val="1"/>
+      <w:numFmt w:val="bullet"/>
+      <w:lvlText w:val=""/>
+      <w:lvlJc w:val="left"/>
+      <w:pPr>
+        <w:tabs>
+          <w:tab w:val="num" w:pos="2880"/>
+        </w:tabs>
+        <w:ind w:left="2880" w:hanging="360"/>
+      </w:pPr>
+      <w:rPr>
+        <w:rFonts w:ascii="Symbol" w:hAnsi="Symbol" w:hint="default"/>
+        <w:sz w:val="20"/>
+      </w:rPr>
+    </w:lvl>
+    <w:lvl w:ilvl="4" w:tentative="1">
+      <w:start w:val="1"/>
+      <w:numFmt w:val="bullet"/>
+      <w:lvlText w:val=""/>
+      <w:lvlJc w:val="left"/>
+      <w:pPr>
+        <w:tabs>
+          <w:tab w:val="num" w:pos="3600"/>
+        </w:tabs>
+        <w:ind w:left="3600" w:hanging="360"/>
+      </w:pPr>
+      <w:rPr>
+        <w:rFonts w:ascii="Symbol" w:hAnsi="Symbol" w:hint="default"/>
+        <w:sz w:val="20"/>
+      </w:rPr>
+    </w:lvl>
+    <w:lvl w:ilvl="5" w:tentative="1">
+      <w:start w:val="1"/>
+      <w:numFmt w:val="bullet"/>
+      <w:lvlText w:val=""/>
+      <w:lvlJc w:val="left"/>
+      <w:pPr>
+        <w:tabs>
+          <w:tab w:val="num" w:pos="4320"/>
+        </w:tabs>
+        <w:ind w:left="4320" w:hanging="360"/>
+      </w:pPr>
+      <w:rPr>
+        <w:rFonts w:ascii="Symbol" w:hAnsi="Symbol" w:hint="default"/>
+        <w:sz w:val="20"/>
+      </w:rPr>
+    </w:lvl>
+    <w:lvl w:ilvl="6" w:tentative="1">
+      <w:start w:val="1"/>
+      <w:numFmt w:val="bullet"/>
+      <w:lvlText w:val=""/>
+      <w:lvlJc w:val="left"/>
+      <w:pPr>
+        <w:tabs>
+          <w:tab w:val="num" w:pos="5040"/>
+        </w:tabs>
+        <w:ind w:left="5040" w:hanging="360"/>
+      </w:pPr>
+      <w:rPr>
+        <w:rFonts w:ascii="Symbol" w:hAnsi="Symbol" w:hint="default"/>
+        <w:sz w:val="20"/>
+      </w:rPr>
+    </w:lvl>
+    <w:lvl w:ilvl="7" w:tentative="1">
+      <w:start w:val="1"/>
+      <w:numFmt w:val="bullet"/>
+      <w:lvlText w:val=""/>
+      <w:lvlJc w:val="left"/>
+      <w:pPr>
+        <w:tabs>
+          <w:tab w:val="num" w:pos="5760"/>
+        </w:tabs>
+        <w:ind w:left="5760" w:hanging="360"/>
+      </w:pPr>
+      <w:rPr>
+        <w:rFonts w:ascii="Symbol" w:hAnsi="Symbol" w:hint="default"/>
+        <w:sz w:val="20"/>
+      </w:rPr>
+    </w:lvl>
+    <w:lvl w:ilvl="8" w:tentative="1">
+      <w:start w:val="1"/>
+      <w:numFmt w:val="bullet"/>
+      <w:lvlText w:val=""/>
+      <w:lvlJc w:val="left"/>
+      <w:pPr>
+        <w:tabs>
+          <w:tab w:val="num" w:pos="6480"/>
+        </w:tabs>
+        <w:ind w:left="6480" w:hanging="360"/>
+      </w:pPr>
+      <w:rPr>
+        <w:rFonts w:ascii="Symbol" w:hAnsi="Symbol" w:hint="default"/>
+        <w:sz w:val="20"/>
+      </w:rPr>
+    </w:lvl>
+  </w:abstractNum>
+  <w:abstractNum w:abstractNumId="1" w15:restartNumberingAfterBreak="0">
+    <w:nsid w:val="0E016CC7"/>
+    <w:multiLevelType w:val="multilevel"/>
+    <w:tmpl w:val="987C4BFA"/>
+    <w:lvl w:ilvl="0">
+      <w:start w:val="1"/>
+      <w:numFmt w:val="bullet"/>
+      <w:lvlText w:val=""/>
+      <w:lvlJc w:val="left"/>
+      <w:pPr>
+        <w:tabs>
+          <w:tab w:val="num" w:pos="720"/>
+        </w:tabs>
+        <w:ind w:left="720" w:hanging="360"/>
+      </w:pPr>
+      <w:rPr>
+        <w:rFonts w:ascii="Symbol" w:hAnsi="Symbol" w:hint="default"/>
+        <w:sz w:val="20"/>
+      </w:rPr>
+    </w:lvl>
+    <w:lvl w:ilvl="1">
+      <w:start w:val="1"/>
+      <w:numFmt w:val="bullet"/>
+      <w:lvlText w:val=""/>
+      <w:lvlJc w:val="left"/>
+      <w:pPr>
+        <w:tabs>
+          <w:tab w:val="num" w:pos="1440"/>
+        </w:tabs>
+        <w:ind w:left="1440" w:hanging="360"/>
+      </w:pPr>
+      <w:rPr>
+        <w:rFonts w:ascii="Symbol" w:hAnsi="Symbol" w:hint="default"/>
+        <w:sz w:val="20"/>
+      </w:rPr>
+    </w:lvl>
+    <w:lvl w:ilvl="2" w:tentative="1">
+      <w:start w:val="1"/>
+      <w:numFmt w:val="bullet"/>
+      <w:lvlText w:val=""/>
+      <w:lvlJc w:val="left"/>
+      <w:pPr>
+        <w:tabs>
+          <w:tab w:val="num" w:pos="2160"/>
+        </w:tabs>
+        <w:ind w:left="2160" w:hanging="360"/>
+      </w:pPr>
+      <w:rPr>
+        <w:rFonts w:ascii="Symbol" w:hAnsi="Symbol" w:hint="default"/>
+        <w:sz w:val="20"/>
+      </w:rPr>
+    </w:lvl>
+    <w:lvl w:ilvl="3" w:tentative="1">
+      <w:start w:val="1"/>
+      <w:numFmt w:val="bullet"/>
+      <w:lvlText w:val=""/>
+      <w:lvlJc w:val="left"/>
+      <w:pPr>
+        <w:tabs>
+          <w:tab w:val="num" w:pos="2880"/>
+        </w:tabs>
+        <w:ind w:left="2880" w:hanging="360"/>
+      </w:pPr>
+      <w:rPr>
+        <w:rFonts w:ascii="Symbol" w:hAnsi="Symbol" w:hint="default"/>
+        <w:sz w:val="20"/>
+      </w:rPr>
+    </w:lvl>
+    <w:lvl w:ilvl="4" w:tentative="1">
+      <w:start w:val="1"/>
+      <w:numFmt w:val="bullet"/>
+      <w:lvlText w:val=""/>
+      <w:lvlJc w:val="left"/>
+      <w:pPr>
+        <w:tabs>
+          <w:tab w:val="num" w:pos="3600"/>
+        </w:tabs>
+        <w:ind w:left="3600" w:hanging="360"/>
+      </w:pPr>
+      <w:rPr>
+        <w:rFonts w:ascii="Symbol" w:hAnsi="Symbol" w:hint="default"/>
+        <w:sz w:val="20"/>
+      </w:rPr>
+    </w:lvl>
+    <w:lvl w:ilvl="5" w:tentative="1">
+      <w:start w:val="1"/>
+      <w:numFmt w:val="bullet"/>
+      <w:lvlText w:val=""/>
+      <w:lvlJc w:val="left"/>
+      <w:pPr>
+        <w:tabs>
+          <w:tab w:val="num" w:pos="4320"/>
+        </w:tabs>
+        <w:ind w:left="4320" w:hanging="360"/>
+      </w:pPr>
+      <w:rPr>
+        <w:rFonts w:ascii="Symbol" w:hAnsi="Symbol" w:hint="default"/>
+        <w:sz w:val="20"/>
+      </w:rPr>
+    </w:lvl>
+    <w:lvl w:ilvl="6" w:tentative="1">
+      <w:start w:val="1"/>
+      <w:numFmt w:val="bullet"/>
+      <w:lvlText w:val=""/>
+      <w:lvlJc w:val="left"/>
+      <w:pPr>
+        <w:tabs>
+          <w:tab w:val="num" w:pos="5040"/>
+        </w:tabs>
+        <w:ind w:left="5040" w:hanging="360"/>
+      </w:pPr>
+      <w:rPr>
+        <w:rFonts w:ascii="Symbol" w:hAnsi="Symbol" w:hint="default"/>
+        <w:sz w:val="20"/>
+      </w:rPr>
+    </w:lvl>
+    <w:lvl w:ilvl="7" w:tentative="1">
+      <w:start w:val="1"/>
+      <w:numFmt w:val="bullet"/>
+      <w:lvlText w:val=""/>
+      <w:lvlJc w:val="left"/>
+      <w:pPr>
+        <w:tabs>
+          <w:tab w:val="num" w:pos="5760"/>
+        </w:tabs>
+        <w:ind w:left="5760" w:hanging="360"/>
+      </w:pPr>
+      <w:rPr>
+        <w:rFonts w:ascii="Symbol" w:hAnsi="Symbol" w:hint="default"/>
+        <w:sz w:val="20"/>
+      </w:rPr>
+    </w:lvl>
+    <w:lvl w:ilvl="8" w:tentative="1">
+      <w:start w:val="1"/>
+      <w:numFmt w:val="bullet"/>
+      <w:lvlText w:val=""/>
+      <w:lvlJc w:val="left"/>
+      <w:pPr>
+        <w:tabs>
+          <w:tab w:val="num" w:pos="6480"/>
+        </w:tabs>
+        <w:ind w:left="6480" w:hanging="360"/>
+      </w:pPr>
+      <w:rPr>
+        <w:rFonts w:ascii="Symbol" w:hAnsi="Symbol" w:hint="default"/>
+        <w:sz w:val="20"/>
+      </w:rPr>
+    </w:lvl>
+  </w:abstractNum>
+  <w:abstractNum w:abstractNumId="2" w15:restartNumberingAfterBreak="0">
     <w:nsid w:val="1C982182"/>
     <w:multiLevelType w:val="multilevel"/>
     <w:tmpl w:val="54FCE0B6"/>
@@ -8158,7 +9858,7 @@
       </w:rPr>
     </w:lvl>
   </w:abstractNum>
-  <w:abstractNum w:abstractNumId="1" w15:restartNumberingAfterBreak="0">
+  <w:abstractNum w:abstractNumId="3" w15:restartNumberingAfterBreak="0">
     <w:nsid w:val="1CA52656"/>
     <w:multiLevelType w:val="multilevel"/>
     <w:tmpl w:val="EAD219B2"/>
@@ -8307,7 +10007,156 @@
       </w:rPr>
     </w:lvl>
   </w:abstractNum>
-  <w:abstractNum w:abstractNumId="2" w15:restartNumberingAfterBreak="0">
+  <w:abstractNum w:abstractNumId="4" w15:restartNumberingAfterBreak="0">
+    <w:nsid w:val="1EF001DB"/>
+    <w:multiLevelType w:val="multilevel"/>
+    <w:tmpl w:val="AFFE217E"/>
+    <w:lvl w:ilvl="0">
+      <w:start w:val="1"/>
+      <w:numFmt w:val="bullet"/>
+      <w:lvlText w:val=""/>
+      <w:lvlJc w:val="left"/>
+      <w:pPr>
+        <w:tabs>
+          <w:tab w:val="num" w:pos="720"/>
+        </w:tabs>
+        <w:ind w:left="720" w:hanging="360"/>
+      </w:pPr>
+      <w:rPr>
+        <w:rFonts w:ascii="Symbol" w:hAnsi="Symbol" w:hint="default"/>
+        <w:sz w:val="20"/>
+      </w:rPr>
+    </w:lvl>
+    <w:lvl w:ilvl="1" w:tentative="1">
+      <w:start w:val="1"/>
+      <w:numFmt w:val="bullet"/>
+      <w:lvlText w:val=""/>
+      <w:lvlJc w:val="left"/>
+      <w:pPr>
+        <w:tabs>
+          <w:tab w:val="num" w:pos="1440"/>
+        </w:tabs>
+        <w:ind w:left="1440" w:hanging="360"/>
+      </w:pPr>
+      <w:rPr>
+        <w:rFonts w:ascii="Symbol" w:hAnsi="Symbol" w:hint="default"/>
+        <w:sz w:val="20"/>
+      </w:rPr>
+    </w:lvl>
+    <w:lvl w:ilvl="2" w:tentative="1">
+      <w:start w:val="1"/>
+      <w:numFmt w:val="bullet"/>
+      <w:lvlText w:val=""/>
+      <w:lvlJc w:val="left"/>
+      <w:pPr>
+        <w:tabs>
+          <w:tab w:val="num" w:pos="2160"/>
+        </w:tabs>
+        <w:ind w:left="2160" w:hanging="360"/>
+      </w:pPr>
+      <w:rPr>
+        <w:rFonts w:ascii="Symbol" w:hAnsi="Symbol" w:hint="default"/>
+        <w:sz w:val="20"/>
+      </w:rPr>
+    </w:lvl>
+    <w:lvl w:ilvl="3" w:tentative="1">
+      <w:start w:val="1"/>
+      <w:numFmt w:val="bullet"/>
+      <w:lvlText w:val=""/>
+      <w:lvlJc w:val="left"/>
+      <w:pPr>
+        <w:tabs>
+          <w:tab w:val="num" w:pos="2880"/>
+        </w:tabs>
+        <w:ind w:left="2880" w:hanging="360"/>
+      </w:pPr>
+      <w:rPr>
+        <w:rFonts w:ascii="Symbol" w:hAnsi="Symbol" w:hint="default"/>
+        <w:sz w:val="20"/>
+      </w:rPr>
+    </w:lvl>
+    <w:lvl w:ilvl="4" w:tentative="1">
+      <w:start w:val="1"/>
+      <w:numFmt w:val="bullet"/>
+      <w:lvlText w:val=""/>
+      <w:lvlJc w:val="left"/>
+      <w:pPr>
+        <w:tabs>
+          <w:tab w:val="num" w:pos="3600"/>
+        </w:tabs>
+        <w:ind w:left="3600" w:hanging="360"/>
+      </w:pPr>
+      <w:rPr>
+        <w:rFonts w:ascii="Symbol" w:hAnsi="Symbol" w:hint="default"/>
+        <w:sz w:val="20"/>
+      </w:rPr>
+    </w:lvl>
+    <w:lvl w:ilvl="5" w:tentative="1">
+      <w:start w:val="1"/>
+      <w:numFmt w:val="bullet"/>
+      <w:lvlText w:val=""/>
+      <w:lvlJc w:val="left"/>
+      <w:pPr>
+        <w:tabs>
+          <w:tab w:val="num" w:pos="4320"/>
+        </w:tabs>
+        <w:ind w:left="4320" w:hanging="360"/>
+      </w:pPr>
+      <w:rPr>
+        <w:rFonts w:ascii="Symbol" w:hAnsi="Symbol" w:hint="default"/>
+        <w:sz w:val="20"/>
+      </w:rPr>
+    </w:lvl>
+    <w:lvl w:ilvl="6" w:tentative="1">
+      <w:start w:val="1"/>
+      <w:numFmt w:val="bullet"/>
+      <w:lvlText w:val=""/>
+      <w:lvlJc w:val="left"/>
+      <w:pPr>
+        <w:tabs>
+          <w:tab w:val="num" w:pos="5040"/>
+        </w:tabs>
+        <w:ind w:left="5040" w:hanging="360"/>
+      </w:pPr>
+      <w:rPr>
+        <w:rFonts w:ascii="Symbol" w:hAnsi="Symbol" w:hint="default"/>
+        <w:sz w:val="20"/>
+      </w:rPr>
+    </w:lvl>
+    <w:lvl w:ilvl="7" w:tentative="1">
+      <w:start w:val="1"/>
+      <w:numFmt w:val="bullet"/>
+      <w:lvlText w:val=""/>
+      <w:lvlJc w:val="left"/>
+      <w:pPr>
+        <w:tabs>
+          <w:tab w:val="num" w:pos="5760"/>
+        </w:tabs>
+        <w:ind w:left="5760" w:hanging="360"/>
+      </w:pPr>
+      <w:rPr>
+        <w:rFonts w:ascii="Symbol" w:hAnsi="Symbol" w:hint="default"/>
+        <w:sz w:val="20"/>
+      </w:rPr>
+    </w:lvl>
+    <w:lvl w:ilvl="8" w:tentative="1">
+      <w:start w:val="1"/>
+      <w:numFmt w:val="bullet"/>
+      <w:lvlText w:val=""/>
+      <w:lvlJc w:val="left"/>
+      <w:pPr>
+        <w:tabs>
+          <w:tab w:val="num" w:pos="6480"/>
+        </w:tabs>
+        <w:ind w:left="6480" w:hanging="360"/>
+      </w:pPr>
+      <w:rPr>
+        <w:rFonts w:ascii="Symbol" w:hAnsi="Symbol" w:hint="default"/>
+        <w:sz w:val="20"/>
+      </w:rPr>
+    </w:lvl>
+  </w:abstractNum>
+  <w:abstractNum w:abstractNumId="5" w15:restartNumberingAfterBreak="0">
     <w:nsid w:val="24337C2E"/>
     <w:multiLevelType w:val="multilevel"/>
     <w:tmpl w:val="A6941D3A"/>
@@ -8456,7 +10305,7 @@
       </w:rPr>
     </w:lvl>
   </w:abstractNum>
-  <w:abstractNum w:abstractNumId="3" w15:restartNumberingAfterBreak="0">
+  <w:abstractNum w:abstractNumId="6" w15:restartNumberingAfterBreak="0">
     <w:nsid w:val="24B15931"/>
     <w:multiLevelType w:val="multilevel"/>
     <w:tmpl w:val="C7D859C4"/>
@@ -8605,7 +10454,7 @@
       </w:rPr>
     </w:lvl>
   </w:abstractNum>
-  <w:abstractNum w:abstractNumId="4" w15:restartNumberingAfterBreak="0">
+  <w:abstractNum w:abstractNumId="7" w15:restartNumberingAfterBreak="0">
     <w:nsid w:val="24D250F1"/>
     <w:multiLevelType w:val="multilevel"/>
     <w:tmpl w:val="E65E67EE"/>
@@ -8754,7 +10603,7 @@
       </w:rPr>
     </w:lvl>
   </w:abstractNum>
-  <w:abstractNum w:abstractNumId="5" w15:restartNumberingAfterBreak="0">
+  <w:abstractNum w:abstractNumId="8" w15:restartNumberingAfterBreak="0">
     <w:nsid w:val="33DE7B50"/>
     <w:multiLevelType w:val="multilevel"/>
     <w:tmpl w:val="135646A0"/>
@@ -8903,7 +10752,7 @@
       </w:rPr>
     </w:lvl>
   </w:abstractNum>
-  <w:abstractNum w:abstractNumId="6" w15:restartNumberingAfterBreak="0">
+  <w:abstractNum w:abstractNumId="9" w15:restartNumberingAfterBreak="0">
     <w:nsid w:val="357D4BB3"/>
     <w:multiLevelType w:val="multilevel"/>
     <w:tmpl w:val="A9C430E6"/>
@@ -9020,7 +10869,7 @@
       </w:pPr>
     </w:lvl>
   </w:abstractNum>
-  <w:abstractNum w:abstractNumId="7" w15:restartNumberingAfterBreak="0">
+  <w:abstractNum w:abstractNumId="10" w15:restartNumberingAfterBreak="0">
     <w:nsid w:val="3A4A5F46"/>
     <w:multiLevelType w:val="multilevel"/>
     <w:tmpl w:val="76367480"/>
@@ -9169,7 +11018,7 @@
       </w:rPr>
     </w:lvl>
   </w:abstractNum>
-  <w:abstractNum w:abstractNumId="8" w15:restartNumberingAfterBreak="0">
+  <w:abstractNum w:abstractNumId="11" w15:restartNumberingAfterBreak="0">
     <w:nsid w:val="49187205"/>
     <w:multiLevelType w:val="multilevel"/>
     <w:tmpl w:val="D6FAC60A"/>
@@ -9282,7 +11131,7 @@
       </w:pPr>
     </w:lvl>
   </w:abstractNum>
-  <w:abstractNum w:abstractNumId="9" w15:restartNumberingAfterBreak="0">
+  <w:abstractNum w:abstractNumId="12" w15:restartNumberingAfterBreak="0">
     <w:nsid w:val="50CB51D2"/>
     <w:multiLevelType w:val="multilevel"/>
     <w:tmpl w:val="55E2445E"/>
@@ -9431,7 +11280,7 @@
       </w:rPr>
     </w:lvl>
   </w:abstractNum>
-  <w:abstractNum w:abstractNumId="10" w15:restartNumberingAfterBreak="0">
+  <w:abstractNum w:abstractNumId="13" w15:restartNumberingAfterBreak="0">
     <w:nsid w:val="576D4582"/>
     <w:multiLevelType w:val="multilevel"/>
     <w:tmpl w:val="7B000EF0"/>
@@ -9580,7 +11429,7 @@
       </w:rPr>
     </w:lvl>
   </w:abstractNum>
-  <w:abstractNum w:abstractNumId="11" w15:restartNumberingAfterBreak="0">
+  <w:abstractNum w:abstractNumId="14" w15:restartNumberingAfterBreak="0">
     <w:nsid w:val="57B0471A"/>
     <w:multiLevelType w:val="multilevel"/>
     <w:tmpl w:val="F5D468B0"/>
@@ -9729,7 +11578,156 @@
       </w:rPr>
     </w:lvl>
   </w:abstractNum>
-  <w:abstractNum w:abstractNumId="12" w15:restartNumberingAfterBreak="0">
+  <w:abstractNum w:abstractNumId="15" w15:restartNumberingAfterBreak="0">
+    <w:nsid w:val="610017FD"/>
+    <w:multiLevelType w:val="multilevel"/>
+    <w:tmpl w:val="EAC4E870"/>
+    <w:lvl w:ilvl="0">
+      <w:start w:val="1"/>
+      <w:numFmt w:val="bullet"/>
+      <w:lvlText w:val=""/>
+      <w:lvlJc w:val="left"/>
+      <w:pPr>
+        <w:tabs>
+          <w:tab w:val="num" w:pos="720"/>
+        </w:tabs>
+        <w:ind w:left="720" w:hanging="360"/>
+      </w:pPr>
+      <w:rPr>
+        <w:rFonts w:ascii="Symbol" w:hAnsi="Symbol" w:hint="default"/>
+        <w:sz w:val="20"/>
+      </w:rPr>
+    </w:lvl>
+    <w:lvl w:ilvl="1" w:tentative="1">
+      <w:start w:val="1"/>
+      <w:numFmt w:val="bullet"/>
+      <w:lvlText w:val=""/>
+      <w:lvlJc w:val="left"/>
+      <w:pPr>
+        <w:tabs>
+          <w:tab w:val="num" w:pos="1440"/>
+        </w:tabs>
+        <w:ind w:left="1440" w:hanging="360"/>
+      </w:pPr>
+      <w:rPr>
+        <w:rFonts w:ascii="Symbol" w:hAnsi="Symbol" w:hint="default"/>
+        <w:sz w:val="20"/>
+      </w:rPr>
+    </w:lvl>
+    <w:lvl w:ilvl="2" w:tentative="1">
+      <w:start w:val="1"/>
+      <w:numFmt w:val="bullet"/>
+      <w:lvlText w:val=""/>
+      <w:lvlJc w:val="left"/>
+      <w:pPr>
+        <w:tabs>
+          <w:tab w:val="num" w:pos="2160"/>
+        </w:tabs>
+        <w:ind w:left="2160" w:hanging="360"/>
+      </w:pPr>
+      <w:rPr>
+        <w:rFonts w:ascii="Symbol" w:hAnsi="Symbol" w:hint="default"/>
+        <w:sz w:val="20"/>
+      </w:rPr>
+    </w:lvl>
+    <w:lvl w:ilvl="3" w:tentative="1">
+      <w:start w:val="1"/>
+      <w:numFmt w:val="bullet"/>
+      <w:lvlText w:val=""/>
+      <w:lvlJc w:val="left"/>
+      <w:pPr>
+        <w:tabs>
+          <w:tab w:val="num" w:pos="2880"/>
+        </w:tabs>
+        <w:ind w:left="2880" w:hanging="360"/>
+      </w:pPr>
+      <w:rPr>
+        <w:rFonts w:ascii="Symbol" w:hAnsi="Symbol" w:hint="default"/>
+        <w:sz w:val="20"/>
+      </w:rPr>
+    </w:lvl>
+    <w:lvl w:ilvl="4" w:tentative="1">
+      <w:start w:val="1"/>
+      <w:numFmt w:val="bullet"/>
+      <w:lvlText w:val=""/>
+      <w:lvlJc w:val="left"/>
+      <w:pPr>
+        <w:tabs>
+          <w:tab w:val="num" w:pos="3600"/>
+        </w:tabs>
+        <w:ind w:left="3600" w:hanging="360"/>
+      </w:pPr>
+      <w:rPr>
+        <w:rFonts w:ascii="Symbol" w:hAnsi="Symbol" w:hint="default"/>
+        <w:sz w:val="20"/>
+      </w:rPr>
+    </w:lvl>
+    <w:lvl w:ilvl="5" w:tentative="1">
+      <w:start w:val="1"/>
+      <w:numFmt w:val="bullet"/>
+      <w:lvlText w:val=""/>
+      <w:lvlJc w:val="left"/>
+      <w:pPr>
+        <w:tabs>
+          <w:tab w:val="num" w:pos="4320"/>
+        </w:tabs>
+        <w:ind w:left="4320" w:hanging="360"/>
+      </w:pPr>
+      <w:rPr>
+        <w:rFonts w:ascii="Symbol" w:hAnsi="Symbol" w:hint="default"/>
+        <w:sz w:val="20"/>
+      </w:rPr>
+    </w:lvl>
+    <w:lvl w:ilvl="6" w:tentative="1">
+      <w:start w:val="1"/>
+      <w:numFmt w:val="bullet"/>
+      <w:lvlText w:val=""/>
+      <w:lvlJc w:val="left"/>
+      <w:pPr>
+        <w:tabs>
+          <w:tab w:val="num" w:pos="5040"/>
+        </w:tabs>
+        <w:ind w:left="5040" w:hanging="360"/>
+      </w:pPr>
+      <w:rPr>
+        <w:rFonts w:ascii="Symbol" w:hAnsi="Symbol" w:hint="default"/>
+        <w:sz w:val="20"/>
+      </w:rPr>
+    </w:lvl>
+    <w:lvl w:ilvl="7" w:tentative="1">
+      <w:start w:val="1"/>
+      <w:numFmt w:val="bullet"/>
+      <w:lvlText w:val=""/>
+      <w:lvlJc w:val="left"/>
+      <w:pPr>
+        <w:tabs>
+          <w:tab w:val="num" w:pos="5760"/>
+        </w:tabs>
+        <w:ind w:left="5760" w:hanging="360"/>
+      </w:pPr>
+      <w:rPr>
+        <w:rFonts w:ascii="Symbol" w:hAnsi="Symbol" w:hint="default"/>
+        <w:sz w:val="20"/>
+      </w:rPr>
+    </w:lvl>
+    <w:lvl w:ilvl="8" w:tentative="1">
+      <w:start w:val="1"/>
+      <w:numFmt w:val="bullet"/>
+      <w:lvlText w:val=""/>
+      <w:lvlJc w:val="left"/>
+      <w:pPr>
+        <w:tabs>
+          <w:tab w:val="num" w:pos="6480"/>
+        </w:tabs>
+        <w:ind w:left="6480" w:hanging="360"/>
+      </w:pPr>
+      <w:rPr>
+        <w:rFonts w:ascii="Symbol" w:hAnsi="Symbol" w:hint="default"/>
+        <w:sz w:val="20"/>
+      </w:rPr>
+    </w:lvl>
+  </w:abstractNum>
+  <w:abstractNum w:abstractNumId="16" w15:restartNumberingAfterBreak="0">
     <w:nsid w:val="63311028"/>
     <w:multiLevelType w:val="multilevel"/>
     <w:tmpl w:val="DFFEA684"/>
@@ -9878,7 +11876,7 @@
       </w:rPr>
     </w:lvl>
   </w:abstractNum>
-  <w:abstractNum w:abstractNumId="13" w15:restartNumberingAfterBreak="0">
+  <w:abstractNum w:abstractNumId="17" w15:restartNumberingAfterBreak="0">
     <w:nsid w:val="64277D17"/>
     <w:multiLevelType w:val="multilevel"/>
     <w:tmpl w:val="4886D0A0"/>
@@ -10027,7 +12025,7 @@
       </w:rPr>
     </w:lvl>
   </w:abstractNum>
-  <w:abstractNum w:abstractNumId="14" w15:restartNumberingAfterBreak="0">
+  <w:abstractNum w:abstractNumId="18" w15:restartNumberingAfterBreak="0">
     <w:nsid w:val="69396C17"/>
     <w:multiLevelType w:val="multilevel"/>
     <w:tmpl w:val="EF646456"/>
@@ -10176,7 +12174,156 @@
       </w:rPr>
     </w:lvl>
   </w:abstractNum>
-  <w:abstractNum w:abstractNumId="15" w15:restartNumberingAfterBreak="0">
+  <w:abstractNum w:abstractNumId="19" w15:restartNumberingAfterBreak="0">
+    <w:nsid w:val="6F6C519D"/>
+    <w:multiLevelType w:val="multilevel"/>
+    <w:tmpl w:val="9AB8117E"/>
+    <w:lvl w:ilvl="0">
+      <w:start w:val="1"/>
+      <w:numFmt w:val="bullet"/>
+      <w:lvlText w:val=""/>
+      <w:lvlJc w:val="left"/>
+      <w:pPr>
+        <w:tabs>
+          <w:tab w:val="num" w:pos="720"/>
+        </w:tabs>
+        <w:ind w:left="720" w:hanging="360"/>
+      </w:pPr>
+      <w:rPr>
+        <w:rFonts w:ascii="Symbol" w:hAnsi="Symbol" w:hint="default"/>
+        <w:sz w:val="20"/>
+      </w:rPr>
+    </w:lvl>
+    <w:lvl w:ilvl="1">
+      <w:start w:val="1"/>
+      <w:numFmt w:val="bullet"/>
+      <w:lvlText w:val=""/>
+      <w:lvlJc w:val="left"/>
+      <w:pPr>
+        <w:tabs>
+          <w:tab w:val="num" w:pos="1440"/>
+        </w:tabs>
+        <w:ind w:left="1440" w:hanging="360"/>
+      </w:pPr>
+      <w:rPr>
+        <w:rFonts w:ascii="Symbol" w:hAnsi="Symbol" w:hint="default"/>
+        <w:sz w:val="20"/>
+      </w:rPr>
+    </w:lvl>
+    <w:lvl w:ilvl="2" w:tentative="1">
+      <w:start w:val="1"/>
+      <w:numFmt w:val="bullet"/>
+      <w:lvlText w:val=""/>
+      <w:lvlJc w:val="left"/>
+      <w:pPr>
+        <w:tabs>
+          <w:tab w:val="num" w:pos="2160"/>
+        </w:tabs>
+        <w:ind w:left="2160" w:hanging="360"/>
+      </w:pPr>
+      <w:rPr>
+        <w:rFonts w:ascii="Symbol" w:hAnsi="Symbol" w:hint="default"/>
+        <w:sz w:val="20"/>
+      </w:rPr>
+    </w:lvl>
+    <w:lvl w:ilvl="3" w:tentative="1">
+      <w:start w:val="1"/>
+      <w:numFmt w:val="bullet"/>
+      <w:lvlText w:val=""/>
+      <w:lvlJc w:val="left"/>
+      <w:pPr>
+        <w:tabs>
+          <w:tab w:val="num" w:pos="2880"/>
+        </w:tabs>
+        <w:ind w:left="2880" w:hanging="360"/>
+      </w:pPr>
+      <w:rPr>
+        <w:rFonts w:ascii="Symbol" w:hAnsi="Symbol" w:hint="default"/>
+        <w:sz w:val="20"/>
+      </w:rPr>
+    </w:lvl>
+    <w:lvl w:ilvl="4" w:tentative="1">
+      <w:start w:val="1"/>
+      <w:numFmt w:val="bullet"/>
+      <w:lvlText w:val=""/>
+      <w:lvlJc w:val="left"/>
+      <w:pPr>
+        <w:tabs>
+          <w:tab w:val="num" w:pos="3600"/>
+        </w:tabs>
+        <w:ind w:left="3600" w:hanging="360"/>
+      </w:pPr>
+      <w:rPr>
+        <w:rFonts w:ascii="Symbol" w:hAnsi="Symbol" w:hint="default"/>
+        <w:sz w:val="20"/>
+      </w:rPr>
+    </w:lvl>
+    <w:lvl w:ilvl="5" w:tentative="1">
+      <w:start w:val="1"/>
+      <w:numFmt w:val="bullet"/>
+      <w:lvlText w:val=""/>
+      <w:lvlJc w:val="left"/>
+      <w:pPr>
+        <w:tabs>
+          <w:tab w:val="num" w:pos="4320"/>
+        </w:tabs>
+        <w:ind w:left="4320" w:hanging="360"/>
+      </w:pPr>
+      <w:rPr>
+        <w:rFonts w:ascii="Symbol" w:hAnsi="Symbol" w:hint="default"/>
+        <w:sz w:val="20"/>
+      </w:rPr>
+    </w:lvl>
+    <w:lvl w:ilvl="6" w:tentative="1">
+      <w:start w:val="1"/>
+      <w:numFmt w:val="bullet"/>
+      <w:lvlText w:val=""/>
+      <w:lvlJc w:val="left"/>
+      <w:pPr>
+        <w:tabs>
+          <w:tab w:val="num" w:pos="5040"/>
+        </w:tabs>
+        <w:ind w:left="5040" w:hanging="360"/>
+      </w:pPr>
+      <w:rPr>
+        <w:rFonts w:ascii="Symbol" w:hAnsi="Symbol" w:hint="default"/>
+        <w:sz w:val="20"/>
+      </w:rPr>
+    </w:lvl>
+    <w:lvl w:ilvl="7" w:tentative="1">
+      <w:start w:val="1"/>
+      <w:numFmt w:val="bullet"/>
+      <w:lvlText w:val=""/>
+      <w:lvlJc w:val="left"/>
+      <w:pPr>
+        <w:tabs>
+          <w:tab w:val="num" w:pos="5760"/>
+        </w:tabs>
+        <w:ind w:left="5760" w:hanging="360"/>
+      </w:pPr>
+      <w:rPr>
+        <w:rFonts w:ascii="Symbol" w:hAnsi="Symbol" w:hint="default"/>
+        <w:sz w:val="20"/>
+      </w:rPr>
+    </w:lvl>
+    <w:lvl w:ilvl="8" w:tentative="1">
+      <w:start w:val="1"/>
+      <w:numFmt w:val="bullet"/>
+      <w:lvlText w:val=""/>
+      <w:lvlJc w:val="left"/>
+      <w:pPr>
+        <w:tabs>
+          <w:tab w:val="num" w:pos="6480"/>
+        </w:tabs>
+        <w:ind w:left="6480" w:hanging="360"/>
+      </w:pPr>
+      <w:rPr>
+        <w:rFonts w:ascii="Symbol" w:hAnsi="Symbol" w:hint="default"/>
+        <w:sz w:val="20"/>
+      </w:rPr>
+    </w:lvl>
+  </w:abstractNum>
+  <w:abstractNum w:abstractNumId="20" w15:restartNumberingAfterBreak="0">
     <w:nsid w:val="734A376A"/>
     <w:multiLevelType w:val="multilevel"/>
     <w:tmpl w:val="3E7A4D7E"/>
@@ -10325,7 +12472,7 @@
       </w:rPr>
     </w:lvl>
   </w:abstractNum>
-  <w:abstractNum w:abstractNumId="16" w15:restartNumberingAfterBreak="0">
+  <w:abstractNum w:abstractNumId="21" w15:restartNumberingAfterBreak="0">
     <w:nsid w:val="76364763"/>
     <w:multiLevelType w:val="multilevel"/>
     <w:tmpl w:val="EEAE4B76"/>
@@ -10446,7 +12593,156 @@
       </w:pPr>
     </w:lvl>
   </w:abstractNum>
-  <w:abstractNum w:abstractNumId="17" w15:restartNumberingAfterBreak="0">
+  <w:abstractNum w:abstractNumId="22" w15:restartNumberingAfterBreak="0">
+    <w:nsid w:val="7638263F"/>
+    <w:multiLevelType w:val="multilevel"/>
+    <w:tmpl w:val="DC9CC698"/>
+    <w:lvl w:ilvl="0">
+      <w:start w:val="1"/>
+      <w:numFmt w:val="bullet"/>
+      <w:lvlText w:val=""/>
+      <w:lvlJc w:val="left"/>
+      <w:pPr>
+        <w:tabs>
+          <w:tab w:val="num" w:pos="720"/>
+        </w:tabs>
+        <w:ind w:left="720" w:hanging="360"/>
+      </w:pPr>
+      <w:rPr>
+        <w:rFonts w:ascii="Symbol" w:hAnsi="Symbol" w:hint="default"/>
+        <w:sz w:val="20"/>
+      </w:rPr>
+    </w:lvl>
+    <w:lvl w:ilvl="1" w:tentative="1">
+      <w:start w:val="1"/>
+      <w:numFmt w:val="bullet"/>
+      <w:lvlText w:val=""/>
+      <w:lvlJc w:val="left"/>
+      <w:pPr>
+        <w:tabs>
+          <w:tab w:val="num" w:pos="1440"/>
+        </w:tabs>
+        <w:ind w:left="1440" w:hanging="360"/>
+      </w:pPr>
+      <w:rPr>
+        <w:rFonts w:ascii="Symbol" w:hAnsi="Symbol" w:hint="default"/>
+        <w:sz w:val="20"/>
+      </w:rPr>
+    </w:lvl>
+    <w:lvl w:ilvl="2" w:tentative="1">
+      <w:start w:val="1"/>
+      <w:numFmt w:val="bullet"/>
+      <w:lvlText w:val=""/>
+      <w:lvlJc w:val="left"/>
+      <w:pPr>
+        <w:tabs>
+          <w:tab w:val="num" w:pos="2160"/>
+        </w:tabs>
+        <w:ind w:left="2160" w:hanging="360"/>
+      </w:pPr>
+      <w:rPr>
+        <w:rFonts w:ascii="Symbol" w:hAnsi="Symbol" w:hint="default"/>
+        <w:sz w:val="20"/>
+      </w:rPr>
+    </w:lvl>
+    <w:lvl w:ilvl="3" w:tentative="1">
+      <w:start w:val="1"/>
+      <w:numFmt w:val="bullet"/>
+      <w:lvlText w:val=""/>
+      <w:lvlJc w:val="left"/>
+      <w:pPr>
+        <w:tabs>
+          <w:tab w:val="num" w:pos="2880"/>
+        </w:tabs>
+        <w:ind w:left="2880" w:hanging="360"/>
+      </w:pPr>
+      <w:rPr>
+        <w:rFonts w:ascii="Symbol" w:hAnsi="Symbol" w:hint="default"/>
+        <w:sz w:val="20"/>
+      </w:rPr>
+    </w:lvl>
+    <w:lvl w:ilvl="4" w:tentative="1">
+      <w:start w:val="1"/>
+      <w:numFmt w:val="bullet"/>
+      <w:lvlText w:val=""/>
+      <w:lvlJc w:val="left"/>
+      <w:pPr>
+        <w:tabs>
+          <w:tab w:val="num" w:pos="3600"/>
+        </w:tabs>
+        <w:ind w:left="3600" w:hanging="360"/>
+      </w:pPr>
+      <w:rPr>
+        <w:rFonts w:ascii="Symbol" w:hAnsi="Symbol" w:hint="default"/>
+        <w:sz w:val="20"/>
+      </w:rPr>
+    </w:lvl>
+    <w:lvl w:ilvl="5" w:tentative="1">
+      <w:start w:val="1"/>
+      <w:numFmt w:val="bullet"/>
+      <w:lvlText w:val=""/>
+      <w:lvlJc w:val="left"/>
+      <w:pPr>
+        <w:tabs>
+          <w:tab w:val="num" w:pos="4320"/>
+        </w:tabs>
+        <w:ind w:left="4320" w:hanging="360"/>
+      </w:pPr>
+      <w:rPr>
+        <w:rFonts w:ascii="Symbol" w:hAnsi="Symbol" w:hint="default"/>
+        <w:sz w:val="20"/>
+      </w:rPr>
+    </w:lvl>
+    <w:lvl w:ilvl="6" w:tentative="1">
+      <w:start w:val="1"/>
+      <w:numFmt w:val="bullet"/>
+      <w:lvlText w:val=""/>
+      <w:lvlJc w:val="left"/>
+      <w:pPr>
+        <w:tabs>
+          <w:tab w:val="num" w:pos="5040"/>
+        </w:tabs>
+        <w:ind w:left="5040" w:hanging="360"/>
+      </w:pPr>
+      <w:rPr>
+        <w:rFonts w:ascii="Symbol" w:hAnsi="Symbol" w:hint="default"/>
+        <w:sz w:val="20"/>
+      </w:rPr>
+    </w:lvl>
+    <w:lvl w:ilvl="7" w:tentative="1">
+      <w:start w:val="1"/>
+      <w:numFmt w:val="bullet"/>
+      <w:lvlText w:val=""/>
+      <w:lvlJc w:val="left"/>
+      <w:pPr>
+        <w:tabs>
+          <w:tab w:val="num" w:pos="5760"/>
+        </w:tabs>
+        <w:ind w:left="5760" w:hanging="360"/>
+      </w:pPr>
+      <w:rPr>
+        <w:rFonts w:ascii="Symbol" w:hAnsi="Symbol" w:hint="default"/>
+        <w:sz w:val="20"/>
+      </w:rPr>
+    </w:lvl>
+    <w:lvl w:ilvl="8" w:tentative="1">
+      <w:start w:val="1"/>
+      <w:numFmt w:val="bullet"/>
+      <w:lvlText w:val=""/>
+      <w:lvlJc w:val="left"/>
+      <w:pPr>
+        <w:tabs>
+          <w:tab w:val="num" w:pos="6480"/>
+        </w:tabs>
+        <w:ind w:left="6480" w:hanging="360"/>
+      </w:pPr>
+      <w:rPr>
+        <w:rFonts w:ascii="Symbol" w:hAnsi="Symbol" w:hint="default"/>
+        <w:sz w:val="20"/>
+      </w:rPr>
+    </w:lvl>
+  </w:abstractNum>
+  <w:abstractNum w:abstractNumId="23" w15:restartNumberingAfterBreak="0">
     <w:nsid w:val="7F897AF9"/>
     <w:multiLevelType w:val="multilevel"/>
     <w:tmpl w:val="0546ABA6"/>
@@ -10596,58 +12892,76 @@
     </w:lvl>
   </w:abstractNum>
   <w:num w:numId="1" w16cid:durableId="1318997318">
+    <w:abstractNumId w:val="16"/>
+  </w:num>
+  <w:num w:numId="2" w16cid:durableId="404836630">
+    <w:abstractNumId w:val="9"/>
+  </w:num>
+  <w:num w:numId="3" w16cid:durableId="1020163765">
+    <w:abstractNumId w:val="5"/>
+  </w:num>
+  <w:num w:numId="4" w16cid:durableId="367024072">
+    <w:abstractNumId w:val="11"/>
+  </w:num>
+  <w:num w:numId="5" w16cid:durableId="1634015746">
+    <w:abstractNumId w:val="14"/>
+  </w:num>
+  <w:num w:numId="6" w16cid:durableId="136266116">
+    <w:abstractNumId w:val="17"/>
+  </w:num>
+  <w:num w:numId="7" w16cid:durableId="1261791291">
+    <w:abstractNumId w:val="7"/>
+  </w:num>
+  <w:num w:numId="8" w16cid:durableId="1280724216">
+    <w:abstractNumId w:val="23"/>
+  </w:num>
+  <w:num w:numId="9" w16cid:durableId="360324385">
+    <w:abstractNumId w:val="3"/>
+  </w:num>
+  <w:num w:numId="10" w16cid:durableId="1986162020">
+    <w:abstractNumId w:val="8"/>
+  </w:num>
+  <w:num w:numId="11" w16cid:durableId="568535622">
+    <w:abstractNumId w:val="20"/>
+  </w:num>
+  <w:num w:numId="12" w16cid:durableId="1678923883">
+    <w:abstractNumId w:val="18"/>
+  </w:num>
+  <w:num w:numId="13" w16cid:durableId="244801133">
     <w:abstractNumId w:val="12"/>
   </w:num>
-  <w:num w:numId="2" w16cid:durableId="404836630">
+  <w:num w:numId="14" w16cid:durableId="1197892169">
+    <w:abstractNumId w:val="13"/>
+  </w:num>
+  <w:num w:numId="15" w16cid:durableId="1118525539">
+    <w:abstractNumId w:val="21"/>
+  </w:num>
+  <w:num w:numId="16" w16cid:durableId="1752388390">
+    <w:abstractNumId w:val="10"/>
+  </w:num>
+  <w:num w:numId="17" w16cid:durableId="292029969">
     <w:abstractNumId w:val="6"/>
   </w:num>
-  <w:num w:numId="3" w16cid:durableId="1020163765">
+  <w:num w:numId="18" w16cid:durableId="773985292">
     <w:abstractNumId w:val="2"/>
   </w:num>
-  <w:num w:numId="4" w16cid:durableId="367024072">
-    <w:abstractNumId w:val="8"/>
+  <w:num w:numId="19" w16cid:durableId="641231318">
+    <w:abstractNumId w:val="19"/>
   </w:num>
-  <w:num w:numId="5" w16cid:durableId="1634015746">
-    <w:abstractNumId w:val="11"/>
-  </w:num>
-  <w:num w:numId="6" w16cid:durableId="136266116">
-    <w:abstractNumId w:val="13"/>
-  </w:num>
-  <w:num w:numId="7" w16cid:durableId="1261791291">
-    <w:abstractNumId w:val="4"/>
-  </w:num>
-  <w:num w:numId="8" w16cid:durableId="1280724216">
-    <w:abstractNumId w:val="17"/>
-  </w:num>
-  <w:num w:numId="9" w16cid:durableId="360324385">
+  <w:num w:numId="20" w16cid:durableId="110050376">
     <w:abstractNumId w:val="1"/>
   </w:num>
-  <w:num w:numId="10" w16cid:durableId="1986162020">
-    <w:abstractNumId w:val="5"/>
-  </w:num>
-  <w:num w:numId="11" w16cid:durableId="568535622">
+  <w:num w:numId="21" w16cid:durableId="1594053400">
     <w:abstractNumId w:val="15"/>
   </w:num>
-  <w:num w:numId="12" w16cid:durableId="1678923883">
-    <w:abstractNumId w:val="14"/>
+  <w:num w:numId="22" w16cid:durableId="154957788">
+    <w:abstractNumId w:val="0"/>
   </w:num>
-  <w:num w:numId="13" w16cid:durableId="244801133">
-    <w:abstractNumId w:val="9"/>
+  <w:num w:numId="23" w16cid:durableId="629365873">
+    <w:abstractNumId w:val="22"/>
   </w:num>
-  <w:num w:numId="14" w16cid:durableId="1197892169">
-    <w:abstractNumId w:val="10"/>
-  </w:num>
-  <w:num w:numId="15" w16cid:durableId="1118525539">
-    <w:abstractNumId w:val="16"/>
-  </w:num>
-  <w:num w:numId="16" w16cid:durableId="1752388390">
-    <w:abstractNumId w:val="7"/>
-  </w:num>
-  <w:num w:numId="17" w16cid:durableId="292029969">
-    <w:abstractNumId w:val="3"/>
-  </w:num>
-  <w:num w:numId="18" w16cid:durableId="773985292">
-    <w:abstractNumId w:val="0"/>
+  <w:num w:numId="24" w16cid:durableId="593249153">
+    <w:abstractNumId w:val="4"/>
   </w:num>
 </w:numbering>
 </file>

</xml_diff>